<commit_message>
Apps document created and office time fixed in app side
</commit_message>
<xml_diff>
--- a/document/late-waiver-request-employee-manual.docx
+++ b/document/late-waiver-request-employee-manual.docx
@@ -2,14 +2,24 @@
 <file path=word/document.xml><?xml version="1.0" encoding="utf-8"?>
 <w:document xmlns:wpc="http://schemas.microsoft.com/office/word/2010/wordprocessingCanvas" xmlns:cx="http://schemas.microsoft.com/office/drawing/2014/chartex" xmlns:cx1="http://schemas.microsoft.com/office/drawing/2015/9/8/chartex" xmlns:cx2="http://schemas.microsoft.com/office/drawing/2015/10/21/chartex" xmlns:cx3="http://schemas.microsoft.com/office/drawing/2016/5/9/chartex" xmlns:cx4="http://schemas.microsoft.com/office/drawing/2016/5/10/chartex" xmlns:cx5="http://schemas.microsoft.com/office/drawing/2016/5/11/chartex" xmlns:cx6="http://schemas.microsoft.com/office/drawing/2016/5/12/chartex" xmlns:cx7="http://schemas.microsoft.com/office/drawing/2016/5/13/chartex" xmlns:cx8="http://schemas.microsoft.com/office/drawing/2016/5/14/chartex" xmlns:mc="http://schemas.openxmlformats.org/markup-compatibility/2006" xmlns:aink="http://schemas.microsoft.com/office/drawing/2016/ink" xmlns:am3d="http://schemas.microsoft.com/office/drawing/2017/model3d" xmlns:o="urn:schemas-microsoft-com:office:office" xmlns:oel="http://schemas.microsoft.com/office/2019/extlst" xmlns:r="http://schemas.openxmlformats.org/officeDocument/2006/relationships" xmlns:m="http://schemas.openxmlformats.org/officeDocument/2006/math" xmlns:v="urn:schemas-microsoft-com:vml" xmlns:wp14="http://schemas.microsoft.com/office/word/2010/wordprocessingDrawing" xmlns:wp="http://schemas.openxmlformats.org/drawingml/2006/wordprocessingDrawing" xmlns:w10="urn:schemas-microsoft-com:office:word" xmlns:w="http://schemas.openxmlformats.org/wordprocessingml/2006/main" xmlns:w14="http://schemas.microsoft.com/office/word/2010/wordml" xmlns:w15="http://schemas.microsoft.com/office/word/2012/wordml" xmlns:w16cex="http://schemas.microsoft.com/office/word/2018/wordml/cex" xmlns:w16cid="http://schemas.microsoft.com/office/word/2016/wordml/cid" xmlns:w16="http://schemas.microsoft.com/office/word/2018/wordml" xmlns:w16du="http://schemas.microsoft.com/office/word/2023/wordml/word16du" xmlns:w16sdtdh="http://schemas.microsoft.com/office/word/2020/wordml/sdtdatahash" xmlns:w16sdtfl="http://schemas.microsoft.com/office/word/2024/wordml/sdtformatlock" xmlns:w16se="http://schemas.microsoft.com/office/word/2015/wordml/symex" xmlns:wpg="http://schemas.microsoft.com/office/word/2010/wordprocessingGroup" xmlns:wpi="http://schemas.microsoft.com/office/word/2010/wordprocessingInk" xmlns:wne="http://schemas.microsoft.com/office/word/2006/wordml" xmlns:wps="http://schemas.microsoft.com/office/word/2010/wordprocessingShape" mc:Ignorable="w14 w15 w16se w16cid w16 w16cex w16sdtdh w16sdtfl w16du wp14">
   <w:body>
-    <w:p/>
+    <w:p>
+      <w:pPr>
+        <w:rPr>
+          <w:rFonts w:ascii="Times New Roman" w:hAnsi="Times New Roman" w:cs="Times New Roman"/>
+        </w:rPr>
+      </w:pPr>
+    </w:p>
     <w:p>
       <w:pPr>
         <w:spacing w:after="80"/>
         <w:jc w:val="center"/>
+        <w:rPr>
+          <w:rFonts w:ascii="Times New Roman" w:hAnsi="Times New Roman" w:cs="Times New Roman"/>
+        </w:rPr>
       </w:pPr>
       <w:r>
         <w:rPr>
+          <w:rFonts w:ascii="Times New Roman" w:hAnsi="Times New Roman" w:cs="Times New Roman"/>
           <w:b/>
           <w:color w:val="2E74B5"/>
           <w:sz w:val="26"/>
@@ -23,15 +33,22 @@
           <w:bottom w:val="single" w:sz="12" w:space="1" w:color="5B9BD5"/>
         </w:pBdr>
         <w:spacing w:before="40" w:after="120"/>
+        <w:rPr>
+          <w:rFonts w:ascii="Times New Roman" w:hAnsi="Times New Roman" w:cs="Times New Roman"/>
+        </w:rPr>
       </w:pPr>
     </w:p>
     <w:p>
       <w:pPr>
         <w:spacing w:before="120" w:after="120"/>
         <w:jc w:val="center"/>
+        <w:rPr>
+          <w:rFonts w:ascii="Times New Roman" w:hAnsi="Times New Roman" w:cs="Times New Roman"/>
+        </w:rPr>
       </w:pPr>
       <w:r>
         <w:rPr>
+          <w:rFonts w:ascii="Times New Roman" w:hAnsi="Times New Roman" w:cs="Times New Roman"/>
           <w:b/>
           <w:color w:val="1F3864"/>
           <w:sz w:val="64"/>
@@ -45,15 +62,22 @@
           <w:bottom w:val="single" w:sz="12" w:space="1" w:color="5B9BD5"/>
         </w:pBdr>
         <w:spacing w:before="40" w:after="120"/>
+        <w:rPr>
+          <w:rFonts w:ascii="Times New Roman" w:hAnsi="Times New Roman" w:cs="Times New Roman"/>
+        </w:rPr>
       </w:pPr>
     </w:p>
     <w:p>
       <w:pPr>
         <w:spacing w:after="280"/>
         <w:jc w:val="center"/>
+        <w:rPr>
+          <w:rFonts w:ascii="Times New Roman" w:hAnsi="Times New Roman" w:cs="Times New Roman"/>
+        </w:rPr>
       </w:pPr>
       <w:r>
         <w:rPr>
+          <w:rFonts w:ascii="Times New Roman" w:hAnsi="Times New Roman" w:cs="Times New Roman"/>
           <w:color w:val="2E74B5"/>
           <w:sz w:val="38"/>
         </w:rPr>
@@ -64,9 +88,13 @@
       <w:pPr>
         <w:spacing w:after="200"/>
         <w:jc w:val="center"/>
+        <w:rPr>
+          <w:rFonts w:ascii="Times New Roman" w:hAnsi="Times New Roman" w:cs="Times New Roman"/>
+        </w:rPr>
       </w:pPr>
       <w:r>
         <w:rPr>
+          <w:rFonts w:ascii="Times New Roman" w:hAnsi="Times New Roman" w:cs="Times New Roman"/>
           <w:i/>
           <w:color w:val="595959"/>
           <w:sz w:val="24"/>
@@ -78,15 +106,19 @@
       <w:pPr>
         <w:spacing w:after="120"/>
         <w:jc w:val="center"/>
+        <w:rPr>
+          <w:rFonts w:ascii="Times New Roman" w:hAnsi="Times New Roman" w:cs="Times New Roman"/>
+        </w:rPr>
       </w:pPr>
       <w:r>
         <w:rPr>
+          <w:rFonts w:ascii="Times New Roman" w:hAnsi="Times New Roman" w:cs="Times New Roman"/>
           <w:noProof/>
         </w:rPr>
         <w:drawing>
-          <wp:inline distT="0" distB="0" distL="0" distR="0" wp14:anchorId="13744039" wp14:editId="29A90615">
-            <wp:extent cx="1873625" cy="3810000"/>
-            <wp:effectExtent l="19050" t="19050" r="12700" b="19050"/>
+          <wp:inline distT="0" distB="0" distL="0" distR="0" wp14:anchorId="13744039" wp14:editId="0EF05CA3">
+            <wp:extent cx="2303707" cy="4684568"/>
+            <wp:effectExtent l="19050" t="19050" r="20955" b="20955"/>
             <wp:docPr id="1" name="Picture 1"/>
             <wp:cNvGraphicFramePr>
               <a:graphicFrameLocks xmlns:a="http://schemas.openxmlformats.org/drawingml/2006/main" noChangeAspect="1"/>
@@ -108,7 +140,7 @@
                   <pic:spPr bwMode="auto">
                     <a:xfrm>
                       <a:off x="0" y="0"/>
-                      <a:ext cx="1874519" cy="3811818"/>
+                      <a:ext cx="2312044" cy="4701521"/>
                     </a:xfrm>
                     <a:prstGeom prst="rect">
                       <a:avLst/>
@@ -153,9 +185,13 @@
     <w:p>
       <w:pPr>
         <w:jc w:val="center"/>
+        <w:rPr>
+          <w:rFonts w:ascii="Times New Roman" w:hAnsi="Times New Roman" w:cs="Times New Roman"/>
+        </w:rPr>
       </w:pPr>
       <w:r>
         <w:rPr>
+          <w:rFonts w:ascii="Times New Roman" w:hAnsi="Times New Roman" w:cs="Times New Roman"/>
           <w:i/>
           <w:color w:val="595959"/>
           <w:sz w:val="21"/>
@@ -164,19 +200,18 @@
       </w:r>
     </w:p>
     <w:p>
-      <w:r>
-        <w:br w:type="page"/>
-      </w:r>
-    </w:p>
-    <w:p>
       <w:pPr>
         <w:pBdr>
           <w:bottom w:val="single" w:sz="8" w:space="4" w:color="5B9BD5"/>
         </w:pBdr>
         <w:spacing w:before="280"/>
+        <w:rPr>
+          <w:rFonts w:ascii="Times New Roman" w:hAnsi="Times New Roman" w:cs="Times New Roman"/>
+        </w:rPr>
       </w:pPr>
       <w:r>
         <w:rPr>
+          <w:rFonts w:ascii="Times New Roman" w:hAnsi="Times New Roman" w:cs="Times New Roman"/>
           <w:b/>
           <w:color w:val="2E74B5"/>
           <w:sz w:val="30"/>
@@ -188,58 +223,84 @@
     <w:p>
       <w:pPr>
         <w:jc w:val="both"/>
+        <w:rPr>
+          <w:rFonts w:ascii="Times New Roman" w:hAnsi="Times New Roman" w:cs="Times New Roman"/>
+        </w:rPr>
       </w:pPr>
       <w:r>
+        <w:rPr>
+          <w:rFonts w:ascii="Times New Roman" w:hAnsi="Times New Roman" w:cs="Times New Roman"/>
+        </w:rPr>
         <w:t xml:space="preserve">When you check in late, the app records the late time and applies a </w:t>
       </w:r>
       <w:r>
         <w:rPr>
+          <w:rFonts w:ascii="Times New Roman" w:hAnsi="Times New Roman" w:cs="Times New Roman"/>
           <w:b/>
           <w:color w:val="1F3864"/>
         </w:rPr>
         <w:t>salary deduction</w:t>
       </w:r>
       <w:r>
+        <w:rPr>
+          <w:rFonts w:ascii="Times New Roman" w:hAnsi="Times New Roman" w:cs="Times New Roman"/>
+        </w:rPr>
         <w:t xml:space="preserve">. If you had a genuine reason for being late, you can use </w:t>
       </w:r>
       <w:r>
         <w:rPr>
+          <w:rFonts w:ascii="Times New Roman" w:hAnsi="Times New Roman" w:cs="Times New Roman"/>
           <w:b/>
           <w:color w:val="1F3864"/>
         </w:rPr>
         <w:t>Late Waiver Request</w:t>
       </w:r>
       <w:r>
+        <w:rPr>
+          <w:rFonts w:ascii="Times New Roman" w:hAnsi="Times New Roman" w:cs="Times New Roman"/>
+        </w:rPr>
         <w:t xml:space="preserve"> to ask your manager to </w:t>
       </w:r>
       <w:r>
         <w:rPr>
+          <w:rFonts w:ascii="Times New Roman" w:hAnsi="Times New Roman" w:cs="Times New Roman"/>
           <w:b/>
           <w:color w:val="1F3864"/>
         </w:rPr>
         <w:t>waive (cancel) that deduction</w:t>
       </w:r>
       <w:r>
+        <w:rPr>
+          <w:rFonts w:ascii="Times New Roman" w:hAnsi="Times New Roman" w:cs="Times New Roman"/>
+        </w:rPr>
         <w:t xml:space="preserve">. You pick the late record, give a reason, and submit it for </w:t>
       </w:r>
       <w:r>
         <w:rPr>
+          <w:rFonts w:ascii="Times New Roman" w:hAnsi="Times New Roman" w:cs="Times New Roman"/>
           <w:b/>
           <w:color w:val="1F3864"/>
         </w:rPr>
         <w:t>approval</w:t>
       </w:r>
       <w:r>
+        <w:rPr>
+          <w:rFonts w:ascii="Times New Roman" w:hAnsi="Times New Roman" w:cs="Times New Roman"/>
+        </w:rPr>
         <w:t xml:space="preserve">. You can track the result under </w:t>
       </w:r>
       <w:r>
         <w:rPr>
+          <w:rFonts w:ascii="Times New Roman" w:hAnsi="Times New Roman" w:cs="Times New Roman"/>
           <w:b/>
           <w:color w:val="1F3864"/>
         </w:rPr>
         <w:t>My Requests</w:t>
       </w:r>
       <w:r>
+        <w:rPr>
+          <w:rFonts w:ascii="Times New Roman" w:hAnsi="Times New Roman" w:cs="Times New Roman"/>
+        </w:rPr>
         <w:t>.</w:t>
       </w:r>
     </w:p>
@@ -251,9 +312,13 @@
         <w:shd w:val="clear" w:color="auto" w:fill="FFF8E1"/>
         <w:spacing w:before="160"/>
         <w:ind w:left="150" w:right="150"/>
+        <w:rPr>
+          <w:rFonts w:ascii="Times New Roman" w:hAnsi="Times New Roman" w:cs="Times New Roman"/>
+        </w:rPr>
       </w:pPr>
       <w:r>
         <w:rPr>
+          <w:rFonts w:ascii="Times New Roman" w:hAnsi="Times New Roman" w:cs="Times New Roman"/>
           <w:i/>
           <w:color w:val="5D4037"/>
         </w:rPr>
@@ -262,9 +327,49 @@
     </w:p>
     <w:p>
       <w:pPr>
+        <w:rPr>
+          <w:rFonts w:ascii="Times New Roman" w:hAnsi="Times New Roman" w:cs="Times New Roman"/>
+        </w:rPr>
+      </w:pPr>
+      <w:r>
+        <w:rPr>
+          <w:rFonts w:ascii="Times New Roman" w:hAnsi="Times New Roman" w:cs="Times New Roman"/>
+          <w:b/>
+        </w:rPr>
+        <w:t xml:space="preserve">About the deduction shown: </w:t>
+      </w:r>
+      <w:r>
+        <w:rPr>
+          <w:rFonts w:ascii="Times New Roman" w:hAnsi="Times New Roman" w:cs="Times New Roman"/>
+        </w:rPr>
+        <w:t xml:space="preserve">the late time and deduction are calculated in your office's </w:t>
+      </w:r>
+      <w:proofErr w:type="spellStart"/>
+      <w:r>
+        <w:rPr>
+          <w:rFonts w:ascii="Times New Roman" w:hAnsi="Times New Roman" w:cs="Times New Roman"/>
+        </w:rPr>
+        <w:t>timezone</w:t>
+      </w:r>
+      <w:proofErr w:type="spellEnd"/>
+      <w:r>
+        <w:rPr>
+          <w:rFonts w:ascii="Times New Roman" w:hAnsi="Times New Roman" w:cs="Times New Roman"/>
+        </w:rPr>
+        <w:t>. Depending on company policy the deduction may be a fixed slab amount or based on your hourly wage; whichever it is, an approved waiver cancels it in full.</w:t>
+      </w:r>
+    </w:p>
+    <w:p>
+      <w:pPr>
         <w:jc w:val="both"/>
+        <w:rPr>
+          <w:rFonts w:ascii="Times New Roman" w:hAnsi="Times New Roman" w:cs="Times New Roman"/>
+        </w:rPr>
       </w:pPr>
       <w:r>
+        <w:rPr>
+          <w:rFonts w:ascii="Times New Roman" w:hAnsi="Times New Roman" w:cs="Times New Roman"/>
+        </w:rPr>
         <w:t>This guide walks you through everything you do, in the order you will do it.</w:t>
       </w:r>
     </w:p>
@@ -274,9 +379,13 @@
           <w:bottom w:val="single" w:sz="8" w:space="4" w:color="5B9BD5"/>
         </w:pBdr>
         <w:spacing w:before="280"/>
+        <w:rPr>
+          <w:rFonts w:ascii="Times New Roman" w:hAnsi="Times New Roman" w:cs="Times New Roman"/>
+        </w:rPr>
       </w:pPr>
       <w:r>
         <w:rPr>
+          <w:rFonts w:ascii="Times New Roman" w:hAnsi="Times New Roman" w:cs="Times New Roman"/>
           <w:b/>
           <w:color w:val="2E74B5"/>
           <w:sz w:val="30"/>
@@ -287,12 +396,19 @@
     <w:p>
       <w:pPr>
         <w:pStyle w:val="ListBullet"/>
+        <w:rPr>
+          <w:rFonts w:ascii="Times New Roman" w:hAnsi="Times New Roman" w:cs="Times New Roman"/>
+        </w:rPr>
       </w:pPr>
       <w:r>
+        <w:rPr>
+          <w:rFonts w:ascii="Times New Roman" w:hAnsi="Times New Roman" w:cs="Times New Roman"/>
+        </w:rPr>
         <w:t xml:space="preserve">Open the app and go to </w:t>
       </w:r>
       <w:r>
         <w:rPr>
+          <w:rFonts w:ascii="Times New Roman" w:hAnsi="Times New Roman" w:cs="Times New Roman"/>
           <w:b/>
           <w:color w:val="1F3864"/>
         </w:rPr>
@@ -302,48 +418,75 @@
     <w:p>
       <w:pPr>
         <w:pStyle w:val="ListBullet"/>
+        <w:rPr>
+          <w:rFonts w:ascii="Times New Roman" w:hAnsi="Times New Roman" w:cs="Times New Roman"/>
+        </w:rPr>
       </w:pPr>
       <w:r>
+        <w:rPr>
+          <w:rFonts w:ascii="Times New Roman" w:hAnsi="Times New Roman" w:cs="Times New Roman"/>
+        </w:rPr>
         <w:t xml:space="preserve">Choose </w:t>
       </w:r>
       <w:r>
         <w:rPr>
+          <w:rFonts w:ascii="Times New Roman" w:hAnsi="Times New Roman" w:cs="Times New Roman"/>
           <w:b/>
           <w:color w:val="1F3864"/>
         </w:rPr>
         <w:t>Late Waiver Request</w:t>
       </w:r>
       <w:r>
+        <w:rPr>
+          <w:rFonts w:ascii="Times New Roman" w:hAnsi="Times New Roman" w:cs="Times New Roman"/>
+        </w:rPr>
         <w:t xml:space="preserve"> and verify your identity</w:t>
       </w:r>
     </w:p>
     <w:p>
       <w:pPr>
         <w:pStyle w:val="ListBullet"/>
+        <w:rPr>
+          <w:rFonts w:ascii="Times New Roman" w:hAnsi="Times New Roman" w:cs="Times New Roman"/>
+        </w:rPr>
       </w:pPr>
       <w:r>
+        <w:rPr>
+          <w:rFonts w:ascii="Times New Roman" w:hAnsi="Times New Roman" w:cs="Times New Roman"/>
+        </w:rPr>
         <w:t xml:space="preserve">Select the </w:t>
       </w:r>
       <w:r>
         <w:rPr>
+          <w:rFonts w:ascii="Times New Roman" w:hAnsi="Times New Roman" w:cs="Times New Roman"/>
           <w:b/>
           <w:color w:val="1F3864"/>
         </w:rPr>
         <w:t>late attendance</w:t>
       </w:r>
       <w:r>
+        <w:rPr>
+          <w:rFonts w:ascii="Times New Roman" w:hAnsi="Times New Roman" w:cs="Times New Roman"/>
+        </w:rPr>
         <w:t xml:space="preserve"> you want waived</w:t>
       </w:r>
     </w:p>
     <w:p>
       <w:pPr>
         <w:pStyle w:val="ListBullet"/>
+        <w:rPr>
+          <w:rFonts w:ascii="Times New Roman" w:hAnsi="Times New Roman" w:cs="Times New Roman"/>
+        </w:rPr>
       </w:pPr>
       <w:r>
+        <w:rPr>
+          <w:rFonts w:ascii="Times New Roman" w:hAnsi="Times New Roman" w:cs="Times New Roman"/>
+        </w:rPr>
         <w:t xml:space="preserve">Enter a </w:t>
       </w:r>
       <w:r>
         <w:rPr>
+          <w:rFonts w:ascii="Times New Roman" w:hAnsi="Times New Roman" w:cs="Times New Roman"/>
           <w:b/>
           <w:color w:val="1F3864"/>
         </w:rPr>
@@ -353,38 +496,65 @@
     <w:p>
       <w:pPr>
         <w:pStyle w:val="ListBullet"/>
+        <w:rPr>
+          <w:rFonts w:ascii="Times New Roman" w:hAnsi="Times New Roman" w:cs="Times New Roman"/>
+        </w:rPr>
       </w:pPr>
       <w:r>
+        <w:rPr>
+          <w:rFonts w:ascii="Times New Roman" w:hAnsi="Times New Roman" w:cs="Times New Roman"/>
+        </w:rPr>
         <w:t xml:space="preserve">Review and </w:t>
       </w:r>
       <w:r>
         <w:rPr>
+          <w:rFonts w:ascii="Times New Roman" w:hAnsi="Times New Roman" w:cs="Times New Roman"/>
           <w:b/>
           <w:color w:val="1F3864"/>
         </w:rPr>
         <w:t>Submit</w:t>
       </w:r>
       <w:r>
+        <w:rPr>
+          <w:rFonts w:ascii="Times New Roman" w:hAnsi="Times New Roman" w:cs="Times New Roman"/>
+        </w:rPr>
         <w:t xml:space="preserve"> for your manager's approval</w:t>
       </w:r>
     </w:p>
     <w:p>
       <w:pPr>
         <w:pStyle w:val="ListBullet"/>
+        <w:rPr>
+          <w:rFonts w:ascii="Times New Roman" w:hAnsi="Times New Roman" w:cs="Times New Roman"/>
+        </w:rPr>
       </w:pPr>
       <w:r>
+        <w:rPr>
+          <w:rFonts w:ascii="Times New Roman" w:hAnsi="Times New Roman" w:cs="Times New Roman"/>
+        </w:rPr>
         <w:t xml:space="preserve">Track the result under </w:t>
       </w:r>
       <w:r>
         <w:rPr>
+          <w:rFonts w:ascii="Times New Roman" w:hAnsi="Times New Roman" w:cs="Times New Roman"/>
           <w:b/>
           <w:color w:val="1F3864"/>
         </w:rPr>
         <w:t>My Requests</w:t>
       </w:r>
       <w:r>
+        <w:rPr>
+          <w:rFonts w:ascii="Times New Roman" w:hAnsi="Times New Roman" w:cs="Times New Roman"/>
+        </w:rPr>
         <w:t xml:space="preserve"> — Pending, Approved or Rejected</w:t>
       </w:r>
+    </w:p>
+    <w:p>
+      <w:pPr>
+        <w:rPr>
+          <w:rFonts w:ascii="Times New Roman" w:hAnsi="Times New Roman" w:cs="Times New Roman"/>
+        </w:rPr>
+      </w:pPr>
     </w:p>
     <w:p>
       <w:pPr>
@@ -394,6 +564,9 @@
           <w:numId w:val="0"/>
         </w:numPr>
         <w:ind w:left="360" w:hanging="360"/>
+        <w:rPr>
+          <w:rFonts w:ascii="Times New Roman" w:hAnsi="Times New Roman" w:cs="Times New Roman"/>
+        </w:rPr>
       </w:pPr>
     </w:p>
     <w:p>
@@ -404,6 +577,9 @@
           <w:numId w:val="0"/>
         </w:numPr>
         <w:ind w:left="360" w:hanging="360"/>
+        <w:rPr>
+          <w:rFonts w:ascii="Times New Roman" w:hAnsi="Times New Roman" w:cs="Times New Roman"/>
+        </w:rPr>
       </w:pPr>
     </w:p>
     <w:p>
@@ -414,6 +590,9 @@
           <w:numId w:val="0"/>
         </w:numPr>
         <w:ind w:left="360" w:hanging="360"/>
+        <w:rPr>
+          <w:rFonts w:ascii="Times New Roman" w:hAnsi="Times New Roman" w:cs="Times New Roman"/>
+        </w:rPr>
       </w:pPr>
     </w:p>
     <w:p>
@@ -424,6 +603,9 @@
           <w:numId w:val="0"/>
         </w:numPr>
         <w:ind w:left="360" w:hanging="360"/>
+        <w:rPr>
+          <w:rFonts w:ascii="Times New Roman" w:hAnsi="Times New Roman" w:cs="Times New Roman"/>
+        </w:rPr>
       </w:pPr>
     </w:p>
     <w:p>
@@ -434,6 +616,9 @@
           <w:numId w:val="0"/>
         </w:numPr>
         <w:ind w:left="360" w:hanging="360"/>
+        <w:rPr>
+          <w:rFonts w:ascii="Times New Roman" w:hAnsi="Times New Roman" w:cs="Times New Roman"/>
+        </w:rPr>
       </w:pPr>
     </w:p>
     <w:p>
@@ -444,6 +629,9 @@
           <w:numId w:val="0"/>
         </w:numPr>
         <w:ind w:left="360" w:hanging="360"/>
+        <w:rPr>
+          <w:rFonts w:ascii="Times New Roman" w:hAnsi="Times New Roman" w:cs="Times New Roman"/>
+        </w:rPr>
       </w:pPr>
     </w:p>
     <w:p>
@@ -454,6 +642,9 @@
           <w:numId w:val="0"/>
         </w:numPr>
         <w:ind w:left="360" w:hanging="360"/>
+        <w:rPr>
+          <w:rFonts w:ascii="Times New Roman" w:hAnsi="Times New Roman" w:cs="Times New Roman"/>
+        </w:rPr>
       </w:pPr>
     </w:p>
     <w:p>
@@ -464,6 +655,9 @@
           <w:numId w:val="0"/>
         </w:numPr>
         <w:ind w:left="360" w:hanging="360"/>
+        <w:rPr>
+          <w:rFonts w:ascii="Times New Roman" w:hAnsi="Times New Roman" w:cs="Times New Roman"/>
+        </w:rPr>
       </w:pPr>
     </w:p>
     <w:p>
@@ -474,6 +668,9 @@
           <w:numId w:val="0"/>
         </w:numPr>
         <w:ind w:left="360" w:hanging="360"/>
+        <w:rPr>
+          <w:rFonts w:ascii="Times New Roman" w:hAnsi="Times New Roman" w:cs="Times New Roman"/>
+        </w:rPr>
       </w:pPr>
     </w:p>
     <w:p>
@@ -484,6 +681,9 @@
           <w:numId w:val="0"/>
         </w:numPr>
         <w:ind w:left="360" w:hanging="360"/>
+        <w:rPr>
+          <w:rFonts w:ascii="Times New Roman" w:hAnsi="Times New Roman" w:cs="Times New Roman"/>
+        </w:rPr>
       </w:pPr>
     </w:p>
     <w:p>
@@ -494,6 +694,9 @@
           <w:numId w:val="0"/>
         </w:numPr>
         <w:ind w:left="360" w:hanging="360"/>
+        <w:rPr>
+          <w:rFonts w:ascii="Times New Roman" w:hAnsi="Times New Roman" w:cs="Times New Roman"/>
+        </w:rPr>
       </w:pPr>
     </w:p>
     <w:p>
@@ -504,6 +707,9 @@
           <w:numId w:val="0"/>
         </w:numPr>
         <w:ind w:left="360" w:hanging="360"/>
+        <w:rPr>
+          <w:rFonts w:ascii="Times New Roman" w:hAnsi="Times New Roman" w:cs="Times New Roman"/>
+        </w:rPr>
       </w:pPr>
     </w:p>
     <w:p>
@@ -514,56 +720,23 @@
           <w:numId w:val="0"/>
         </w:numPr>
         <w:ind w:left="360" w:hanging="360"/>
+        <w:rPr>
+          <w:rFonts w:ascii="Times New Roman" w:hAnsi="Times New Roman" w:cs="Times New Roman"/>
+        </w:rPr>
       </w:pPr>
     </w:p>
     <w:p>
       <w:pPr>
-        <w:pStyle w:val="ListBullet"/>
-        <w:numPr>
-          <w:ilvl w:val="0"/>
-          <w:numId w:val="0"/>
-        </w:numPr>
-        <w:ind w:left="360" w:hanging="360"/>
-      </w:pPr>
-    </w:p>
-    <w:p>
-      <w:pPr>
-        <w:pStyle w:val="ListBullet"/>
-        <w:numPr>
-          <w:ilvl w:val="0"/>
-          <w:numId w:val="0"/>
-        </w:numPr>
-        <w:ind w:left="360" w:hanging="360"/>
-      </w:pPr>
-    </w:p>
-    <w:p>
-      <w:pPr>
-        <w:pStyle w:val="ListBullet"/>
-        <w:numPr>
-          <w:ilvl w:val="0"/>
-          <w:numId w:val="0"/>
-        </w:numPr>
-        <w:ind w:left="360" w:hanging="360"/>
-      </w:pPr>
-    </w:p>
-    <w:p>
-      <w:pPr>
-        <w:pStyle w:val="ListBullet"/>
-        <w:numPr>
-          <w:ilvl w:val="0"/>
-          <w:numId w:val="0"/>
-        </w:numPr>
-        <w:ind w:left="360" w:hanging="360"/>
-      </w:pPr>
-    </w:p>
-    <w:p>
-      <w:pPr>
         <w:shd w:val="clear" w:color="auto" w:fill="2F5496"/>
         <w:spacing w:before="140" w:after="140"/>
-        <w:ind w:left="120" w:right="120"/>
+        <w:ind w:right="120"/>
+        <w:rPr>
+          <w:rFonts w:ascii="Times New Roman" w:hAnsi="Times New Roman" w:cs="Times New Roman"/>
+        </w:rPr>
       </w:pPr>
       <w:r>
         <w:rPr>
+          <w:rFonts w:ascii="Times New Roman" w:hAnsi="Times New Roman" w:cs="Times New Roman"/>
           <w:b/>
           <w:color w:val="FFFFFF"/>
           <w:sz w:val="30"/>
@@ -575,9 +748,13 @@
     <w:p>
       <w:pPr>
         <w:spacing w:before="240" w:after="80"/>
+        <w:rPr>
+          <w:rFonts w:ascii="Times New Roman" w:hAnsi="Times New Roman" w:cs="Times New Roman"/>
+        </w:rPr>
       </w:pPr>
       <w:r>
         <w:rPr>
+          <w:rFonts w:ascii="Times New Roman" w:hAnsi="Times New Roman" w:cs="Times New Roman"/>
           <w:b/>
           <w:color w:val="FFFFFF"/>
           <w:sz w:val="20"/>
@@ -586,10 +763,14 @@
         <w:t xml:space="preserve">  Step 1  </w:t>
       </w:r>
       <w:r>
+        <w:rPr>
+          <w:rFonts w:ascii="Times New Roman" w:hAnsi="Times New Roman" w:cs="Times New Roman"/>
+        </w:rPr>
         <w:t xml:space="preserve">  </w:t>
       </w:r>
       <w:r>
         <w:rPr>
+          <w:rFonts w:ascii="Times New Roman" w:hAnsi="Times New Roman" w:cs="Times New Roman"/>
           <w:b/>
           <w:color w:val="2E74B5"/>
           <w:sz w:val="26"/>
@@ -600,44 +781,65 @@
     <w:p>
       <w:pPr>
         <w:jc w:val="both"/>
+        <w:rPr>
+          <w:rFonts w:ascii="Times New Roman" w:hAnsi="Times New Roman" w:cs="Times New Roman"/>
+        </w:rPr>
       </w:pPr>
       <w:r>
+        <w:rPr>
+          <w:rFonts w:ascii="Times New Roman" w:hAnsi="Times New Roman" w:cs="Times New Roman"/>
+        </w:rPr>
         <w:t xml:space="preserve">On your phone, open the Employee Attendance app. From the 369ai.Biz home screen, open </w:t>
       </w:r>
       <w:r>
         <w:rPr>
+          <w:rFonts w:ascii="Times New Roman" w:hAnsi="Times New Roman" w:cs="Times New Roman"/>
           <w:b/>
           <w:color w:val="1F3864"/>
         </w:rPr>
         <w:t>All Options</w:t>
       </w:r>
       <w:r>
+        <w:rPr>
+          <w:rFonts w:ascii="Times New Roman" w:hAnsi="Times New Roman" w:cs="Times New Roman"/>
+        </w:rPr>
         <w:t xml:space="preserve">, scroll down to the </w:t>
       </w:r>
       <w:r>
         <w:rPr>
+          <w:rFonts w:ascii="Times New Roman" w:hAnsi="Times New Roman" w:cs="Times New Roman"/>
           <w:b/>
           <w:color w:val="1F3864"/>
         </w:rPr>
         <w:t>HR &amp; Tracking</w:t>
       </w:r>
       <w:r>
+        <w:rPr>
+          <w:rFonts w:ascii="Times New Roman" w:hAnsi="Times New Roman" w:cs="Times New Roman"/>
+        </w:rPr>
         <w:t xml:space="preserve"> section, and tap </w:t>
       </w:r>
       <w:r>
         <w:rPr>
+          <w:rFonts w:ascii="Times New Roman" w:hAnsi="Times New Roman" w:cs="Times New Roman"/>
           <w:b/>
           <w:color w:val="1F3864"/>
         </w:rPr>
         <w:t>User Attendance</w:t>
       </w:r>
       <w:r>
+        <w:rPr>
+          <w:rFonts w:ascii="Times New Roman" w:hAnsi="Times New Roman" w:cs="Times New Roman"/>
+        </w:rPr>
         <w:t>.</w:t>
       </w:r>
     </w:p>
     <w:p>
       <w:pPr>
         <w:jc w:val="both"/>
+        <w:rPr>
+          <w:rFonts w:ascii="Times New Roman" w:hAnsi="Times New Roman" w:cs="Times New Roman"/>
+        </w:rPr>
       </w:pPr>
     </w:p>
     <w:tbl>
@@ -647,9 +849,9 @@
         <w:tblLook w:val="04A0" w:firstRow="1" w:lastRow="0" w:firstColumn="1" w:lastColumn="0" w:noHBand="0" w:noVBand="1"/>
       </w:tblPr>
       <w:tblGrid>
-        <w:gridCol w:w="3120"/>
-        <w:gridCol w:w="3120"/>
-        <w:gridCol w:w="3120"/>
+        <w:gridCol w:w="3174"/>
+        <w:gridCol w:w="3175"/>
+        <w:gridCol w:w="3227"/>
       </w:tblGrid>
       <w:tr>
         <w:trPr>
@@ -662,15 +864,19 @@
           <w:p>
             <w:pPr>
               <w:jc w:val="center"/>
+              <w:rPr>
+                <w:rFonts w:ascii="Times New Roman" w:hAnsi="Times New Roman" w:cs="Times New Roman"/>
+              </w:rPr>
             </w:pPr>
             <w:r>
               <w:rPr>
+                <w:rFonts w:ascii="Times New Roman" w:hAnsi="Times New Roman" w:cs="Times New Roman"/>
                 <w:noProof/>
               </w:rPr>
               <w:drawing>
-                <wp:inline distT="0" distB="0" distL="0" distR="0" wp14:anchorId="768214D5" wp14:editId="7486E859">
-                  <wp:extent cx="1462405" cy="2959100"/>
-                  <wp:effectExtent l="19050" t="19050" r="23495" b="12700"/>
+                <wp:inline distT="0" distB="0" distL="0" distR="0" wp14:anchorId="768214D5" wp14:editId="77880449">
+                  <wp:extent cx="2124075" cy="4297956"/>
+                  <wp:effectExtent l="19050" t="19050" r="9525" b="26670"/>
                   <wp:docPr id="2" name="Picture 2"/>
                   <wp:cNvGraphicFramePr>
                     <a:graphicFrameLocks xmlns:a="http://schemas.openxmlformats.org/drawingml/2006/main" noChangeAspect="1"/>
@@ -692,7 +898,7 @@
                         <pic:spPr bwMode="auto">
                           <a:xfrm>
                             <a:off x="0" y="0"/>
-                            <a:ext cx="1463040" cy="2960385"/>
+                            <a:ext cx="2138408" cy="4326958"/>
                           </a:xfrm>
                           <a:prstGeom prst="rect">
                             <a:avLst/>
@@ -742,15 +948,19 @@
           <w:p>
             <w:pPr>
               <w:jc w:val="center"/>
+              <w:rPr>
+                <w:rFonts w:ascii="Times New Roman" w:hAnsi="Times New Roman" w:cs="Times New Roman"/>
+              </w:rPr>
             </w:pPr>
             <w:r>
               <w:rPr>
+                <w:rFonts w:ascii="Times New Roman" w:hAnsi="Times New Roman" w:cs="Times New Roman"/>
                 <w:noProof/>
               </w:rPr>
               <w:drawing>
-                <wp:inline distT="0" distB="0" distL="0" distR="0" wp14:anchorId="25678273" wp14:editId="55DBDD3D">
-                  <wp:extent cx="1462405" cy="2971800"/>
-                  <wp:effectExtent l="19050" t="19050" r="23495" b="19050"/>
+                <wp:inline distT="0" distB="0" distL="0" distR="0" wp14:anchorId="25678273" wp14:editId="3AD559AF">
+                  <wp:extent cx="2114863" cy="4297680"/>
+                  <wp:effectExtent l="19050" t="19050" r="19050" b="26670"/>
                   <wp:docPr id="3" name="Picture 3"/>
                   <wp:cNvGraphicFramePr>
                     <a:graphicFrameLocks xmlns:a="http://schemas.openxmlformats.org/drawingml/2006/main" noChangeAspect="1"/>
@@ -772,7 +982,7 @@
                         <pic:spPr bwMode="auto">
                           <a:xfrm>
                             <a:off x="0" y="0"/>
-                            <a:ext cx="1463040" cy="2973090"/>
+                            <a:ext cx="2131155" cy="4330788"/>
                           </a:xfrm>
                           <a:prstGeom prst="rect">
                             <a:avLst/>
@@ -822,15 +1032,19 @@
           <w:p>
             <w:pPr>
               <w:jc w:val="center"/>
+              <w:rPr>
+                <w:rFonts w:ascii="Times New Roman" w:hAnsi="Times New Roman" w:cs="Times New Roman"/>
+              </w:rPr>
             </w:pPr>
             <w:r>
               <w:rPr>
+                <w:rFonts w:ascii="Times New Roman" w:hAnsi="Times New Roman" w:cs="Times New Roman"/>
                 <w:noProof/>
               </w:rPr>
               <w:drawing>
-                <wp:inline distT="0" distB="0" distL="0" distR="0" wp14:anchorId="2E61AC45" wp14:editId="049DD238">
-                  <wp:extent cx="1462405" cy="2921000"/>
-                  <wp:effectExtent l="19050" t="19050" r="23495" b="12700"/>
+                <wp:inline distT="0" distB="0" distL="0" distR="0" wp14:anchorId="2E61AC45" wp14:editId="2B6D1636">
+                  <wp:extent cx="2145921" cy="4286250"/>
+                  <wp:effectExtent l="19050" t="19050" r="26035" b="19050"/>
                   <wp:docPr id="4" name="Picture 4"/>
                   <wp:cNvGraphicFramePr>
                     <a:graphicFrameLocks xmlns:a="http://schemas.openxmlformats.org/drawingml/2006/main" noChangeAspect="1"/>
@@ -852,7 +1066,7 @@
                         <pic:spPr bwMode="auto">
                           <a:xfrm>
                             <a:off x="0" y="0"/>
-                            <a:ext cx="1463040" cy="2922268"/>
+                            <a:ext cx="2159201" cy="4312775"/>
                           </a:xfrm>
                           <a:prstGeom prst="rect">
                             <a:avLst/>
@@ -900,64 +1114,77 @@
     <w:p>
       <w:pPr>
         <w:spacing w:after="120"/>
+        <w:rPr>
+          <w:rFonts w:ascii="Times New Roman" w:hAnsi="Times New Roman" w:cs="Times New Roman"/>
+        </w:rPr>
       </w:pPr>
     </w:p>
     <w:p>
       <w:pPr>
         <w:spacing w:after="120"/>
+        <w:rPr>
+          <w:rFonts w:ascii="Times New Roman" w:hAnsi="Times New Roman" w:cs="Times New Roman"/>
+        </w:rPr>
       </w:pPr>
     </w:p>
     <w:p>
       <w:pPr>
         <w:spacing w:after="120"/>
+        <w:rPr>
+          <w:rFonts w:ascii="Times New Roman" w:hAnsi="Times New Roman" w:cs="Times New Roman"/>
+        </w:rPr>
       </w:pPr>
     </w:p>
     <w:p>
       <w:pPr>
         <w:spacing w:after="120"/>
+        <w:rPr>
+          <w:rFonts w:ascii="Times New Roman" w:hAnsi="Times New Roman" w:cs="Times New Roman"/>
+        </w:rPr>
       </w:pPr>
     </w:p>
     <w:p>
       <w:pPr>
         <w:spacing w:after="120"/>
+        <w:rPr>
+          <w:rFonts w:ascii="Times New Roman" w:hAnsi="Times New Roman" w:cs="Times New Roman"/>
+        </w:rPr>
       </w:pPr>
     </w:p>
     <w:p>
       <w:pPr>
         <w:spacing w:after="120"/>
+        <w:rPr>
+          <w:rFonts w:ascii="Times New Roman" w:hAnsi="Times New Roman" w:cs="Times New Roman"/>
+        </w:rPr>
       </w:pPr>
     </w:p>
     <w:p>
       <w:pPr>
         <w:spacing w:after="120"/>
+        <w:rPr>
+          <w:rFonts w:ascii="Times New Roman" w:hAnsi="Times New Roman" w:cs="Times New Roman"/>
+        </w:rPr>
       </w:pPr>
     </w:p>
     <w:p>
       <w:pPr>
         <w:spacing w:after="120"/>
+        <w:rPr>
+          <w:rFonts w:ascii="Times New Roman" w:hAnsi="Times New Roman" w:cs="Times New Roman"/>
+        </w:rPr>
       </w:pPr>
     </w:p>
     <w:p>
       <w:pPr>
-        <w:spacing w:after="120"/>
-      </w:pPr>
-    </w:p>
-    <w:p>
-      <w:pPr>
-        <w:spacing w:after="120"/>
-      </w:pPr>
-    </w:p>
-    <w:p>
-      <w:pPr>
-        <w:spacing w:after="120"/>
-      </w:pPr>
-    </w:p>
-    <w:p>
-      <w:pPr>
         <w:spacing w:before="240" w:after="80"/>
+        <w:rPr>
+          <w:rFonts w:ascii="Times New Roman" w:hAnsi="Times New Roman" w:cs="Times New Roman"/>
+        </w:rPr>
       </w:pPr>
       <w:r>
         <w:rPr>
+          <w:rFonts w:ascii="Times New Roman" w:hAnsi="Times New Roman" w:cs="Times New Roman"/>
           <w:b/>
           <w:color w:val="FFFFFF"/>
           <w:sz w:val="20"/>
@@ -967,10 +1194,14 @@
         <w:t xml:space="preserve">  Step 2  </w:t>
       </w:r>
       <w:r>
+        <w:rPr>
+          <w:rFonts w:ascii="Times New Roman" w:hAnsi="Times New Roman" w:cs="Times New Roman"/>
+        </w:rPr>
         <w:t xml:space="preserve">  </w:t>
       </w:r>
       <w:r>
         <w:rPr>
+          <w:rFonts w:ascii="Times New Roman" w:hAnsi="Times New Roman" w:cs="Times New Roman"/>
           <w:b/>
           <w:color w:val="2E74B5"/>
           <w:sz w:val="26"/>
@@ -981,49 +1212,70 @@
     <w:p>
       <w:pPr>
         <w:jc w:val="both"/>
+        <w:rPr>
+          <w:rFonts w:ascii="Times New Roman" w:hAnsi="Times New Roman" w:cs="Times New Roman"/>
+        </w:rPr>
       </w:pPr>
       <w:r>
+        <w:rPr>
+          <w:rFonts w:ascii="Times New Roman" w:hAnsi="Times New Roman" w:cs="Times New Roman"/>
+        </w:rPr>
         <w:t xml:space="preserve">On the </w:t>
       </w:r>
       <w:r>
         <w:rPr>
+          <w:rFonts w:ascii="Times New Roman" w:hAnsi="Times New Roman" w:cs="Times New Roman"/>
           <w:b/>
           <w:color w:val="1F3864"/>
         </w:rPr>
         <w:t>Select Attendance Type</w:t>
       </w:r>
       <w:r>
+        <w:rPr>
+          <w:rFonts w:ascii="Times New Roman" w:hAnsi="Times New Roman" w:cs="Times New Roman"/>
+        </w:rPr>
         <w:t xml:space="preserve"> screen, tap </w:t>
       </w:r>
       <w:r>
         <w:rPr>
+          <w:rFonts w:ascii="Times New Roman" w:hAnsi="Times New Roman" w:cs="Times New Roman"/>
           <w:b/>
           <w:color w:val="1F3864"/>
         </w:rPr>
         <w:t>Late Waiver Request</w:t>
       </w:r>
       <w:r>
+        <w:rPr>
+          <w:rFonts w:ascii="Times New Roman" w:hAnsi="Times New Roman" w:cs="Times New Roman"/>
+        </w:rPr>
         <w:t xml:space="preserve"> (“Request waiver for a late arrival deduction”).</w:t>
       </w:r>
     </w:p>
     <w:p>
       <w:pPr>
         <w:jc w:val="both"/>
+        <w:rPr>
+          <w:rFonts w:ascii="Times New Roman" w:hAnsi="Times New Roman" w:cs="Times New Roman"/>
+        </w:rPr>
       </w:pPr>
     </w:p>
     <w:p>
       <w:pPr>
         <w:spacing w:before="160" w:after="200"/>
         <w:jc w:val="center"/>
+        <w:rPr>
+          <w:rFonts w:ascii="Times New Roman" w:hAnsi="Times New Roman" w:cs="Times New Roman"/>
+        </w:rPr>
       </w:pPr>
       <w:r>
         <w:rPr>
+          <w:rFonts w:ascii="Times New Roman" w:hAnsi="Times New Roman" w:cs="Times New Roman"/>
           <w:noProof/>
         </w:rPr>
         <w:drawing>
-          <wp:inline distT="0" distB="0" distL="0" distR="0" wp14:anchorId="3A8B3E71" wp14:editId="7754AADC">
-            <wp:extent cx="2285365" cy="4584700"/>
-            <wp:effectExtent l="19050" t="19050" r="19685" b="25400"/>
+          <wp:inline distT="0" distB="0" distL="0" distR="0" wp14:anchorId="3A8B3E71" wp14:editId="35D8BA32">
+            <wp:extent cx="2654126" cy="5324475"/>
+            <wp:effectExtent l="19050" t="19050" r="13335" b="9525"/>
             <wp:docPr id="5" name="Picture 5"/>
             <wp:cNvGraphicFramePr>
               <a:graphicFrameLocks xmlns:a="http://schemas.openxmlformats.org/drawingml/2006/main" noChangeAspect="1"/>
@@ -1045,7 +1297,7 @@
                   <pic:spPr bwMode="auto">
                     <a:xfrm>
                       <a:off x="0" y="0"/>
-                      <a:ext cx="2286000" cy="4585974"/>
+                      <a:ext cx="2661893" cy="5340057"/>
                     </a:xfrm>
                     <a:prstGeom prst="rect">
                       <a:avLst/>
@@ -1091,57 +1343,74 @@
       <w:pPr>
         <w:spacing w:before="160" w:after="200"/>
         <w:jc w:val="center"/>
+        <w:rPr>
+          <w:rFonts w:ascii="Times New Roman" w:hAnsi="Times New Roman" w:cs="Times New Roman"/>
+        </w:rPr>
       </w:pPr>
     </w:p>
     <w:p>
       <w:pPr>
         <w:spacing w:before="160" w:after="200"/>
         <w:jc w:val="center"/>
+        <w:rPr>
+          <w:rFonts w:ascii="Times New Roman" w:hAnsi="Times New Roman" w:cs="Times New Roman"/>
+        </w:rPr>
       </w:pPr>
     </w:p>
     <w:p>
       <w:pPr>
         <w:spacing w:before="160" w:after="200"/>
         <w:jc w:val="center"/>
+        <w:rPr>
+          <w:rFonts w:ascii="Times New Roman" w:hAnsi="Times New Roman" w:cs="Times New Roman"/>
+        </w:rPr>
       </w:pPr>
     </w:p>
     <w:p>
       <w:pPr>
         <w:spacing w:before="160" w:after="200"/>
         <w:jc w:val="center"/>
+        <w:rPr>
+          <w:rFonts w:ascii="Times New Roman" w:hAnsi="Times New Roman" w:cs="Times New Roman"/>
+        </w:rPr>
       </w:pPr>
     </w:p>
     <w:p>
       <w:pPr>
         <w:spacing w:before="160" w:after="200"/>
         <w:jc w:val="center"/>
+        <w:rPr>
+          <w:rFonts w:ascii="Times New Roman" w:hAnsi="Times New Roman" w:cs="Times New Roman"/>
+        </w:rPr>
       </w:pPr>
     </w:p>
     <w:p>
       <w:pPr>
-        <w:spacing w:before="160" w:after="200"/>
-        <w:jc w:val="center"/>
-      </w:pPr>
-    </w:p>
-    <w:p>
-      <w:pPr>
         <w:spacing w:before="240" w:after="80"/>
+        <w:rPr>
+          <w:rFonts w:ascii="Times New Roman" w:hAnsi="Times New Roman" w:cs="Times New Roman"/>
+        </w:rPr>
       </w:pPr>
       <w:r>
         <w:rPr>
+          <w:rFonts w:ascii="Times New Roman" w:hAnsi="Times New Roman" w:cs="Times New Roman"/>
           <w:b/>
           <w:color w:val="FFFFFF"/>
           <w:sz w:val="20"/>
           <w:shd w:val="clear" w:color="auto" w:fill="2E74B5"/>
         </w:rPr>
         <w:lastRenderedPageBreak/>
-        <w:t xml:space="preserve">  Step 3  </w:t>
+        <w:t xml:space="preserve"> Step 3  </w:t>
       </w:r>
       <w:r>
+        <w:rPr>
+          <w:rFonts w:ascii="Times New Roman" w:hAnsi="Times New Roman" w:cs="Times New Roman"/>
+        </w:rPr>
         <w:t xml:space="preserve">  </w:t>
       </w:r>
       <w:r>
         <w:rPr>
+          <w:rFonts w:ascii="Times New Roman" w:hAnsi="Times New Roman" w:cs="Times New Roman"/>
           <w:b/>
           <w:color w:val="2E74B5"/>
           <w:sz w:val="26"/>
@@ -1152,59 +1421,84 @@
     <w:p>
       <w:pPr>
         <w:jc w:val="both"/>
+        <w:rPr>
+          <w:rFonts w:ascii="Times New Roman" w:hAnsi="Times New Roman" w:cs="Times New Roman"/>
+        </w:rPr>
       </w:pPr>
       <w:r>
+        <w:rPr>
+          <w:rFonts w:ascii="Times New Roman" w:hAnsi="Times New Roman" w:cs="Times New Roman"/>
+        </w:rPr>
         <w:t xml:space="preserve">Confirm it is really you. Either tap </w:t>
       </w:r>
       <w:r>
         <w:rPr>
+          <w:rFonts w:ascii="Times New Roman" w:hAnsi="Times New Roman" w:cs="Times New Roman"/>
           <w:b/>
           <w:color w:val="1F3864"/>
         </w:rPr>
         <w:t>Scan Fingerprint</w:t>
       </w:r>
       <w:r>
+        <w:rPr>
+          <w:rFonts w:ascii="Times New Roman" w:hAnsi="Times New Roman" w:cs="Times New Roman"/>
+        </w:rPr>
         <w:t xml:space="preserve"> and use your enrolled finger, or type your 4-digit PIN under </w:t>
       </w:r>
       <w:r>
         <w:rPr>
+          <w:rFonts w:ascii="Times New Roman" w:hAnsi="Times New Roman" w:cs="Times New Roman"/>
           <w:b/>
           <w:color w:val="1F3864"/>
         </w:rPr>
         <w:t>Enter PIN</w:t>
       </w:r>
       <w:r>
+        <w:rPr>
+          <w:rFonts w:ascii="Times New Roman" w:hAnsi="Times New Roman" w:cs="Times New Roman"/>
+        </w:rPr>
         <w:t xml:space="preserve"> and tap </w:t>
       </w:r>
       <w:r>
         <w:rPr>
+          <w:rFonts w:ascii="Times New Roman" w:hAnsi="Times New Roman" w:cs="Times New Roman"/>
           <w:b/>
           <w:color w:val="1F3864"/>
         </w:rPr>
         <w:t>Verify PIN</w:t>
       </w:r>
       <w:r>
+        <w:rPr>
+          <w:rFonts w:ascii="Times New Roman" w:hAnsi="Times New Roman" w:cs="Times New Roman"/>
+        </w:rPr>
         <w:t>.</w:t>
       </w:r>
     </w:p>
     <w:p>
       <w:pPr>
         <w:jc w:val="both"/>
+        <w:rPr>
+          <w:rFonts w:ascii="Times New Roman" w:hAnsi="Times New Roman" w:cs="Times New Roman"/>
+        </w:rPr>
       </w:pPr>
     </w:p>
     <w:p>
       <w:pPr>
         <w:spacing w:before="160" w:after="200"/>
         <w:jc w:val="center"/>
+        <w:rPr>
+          <w:rFonts w:ascii="Times New Roman" w:hAnsi="Times New Roman" w:cs="Times New Roman"/>
+        </w:rPr>
       </w:pPr>
       <w:r>
         <w:rPr>
+          <w:rFonts w:ascii="Times New Roman" w:hAnsi="Times New Roman" w:cs="Times New Roman"/>
           <w:noProof/>
         </w:rPr>
         <w:drawing>
-          <wp:inline distT="0" distB="0" distL="0" distR="0" wp14:anchorId="6679D61E" wp14:editId="624494A6">
-            <wp:extent cx="2285365" cy="4584700"/>
-            <wp:effectExtent l="19050" t="19050" r="19685" b="25400"/>
+          <wp:inline distT="0" distB="0" distL="0" distR="0" wp14:anchorId="6679D61E" wp14:editId="320B5B9B">
+            <wp:extent cx="2828925" cy="5675141"/>
+            <wp:effectExtent l="19050" t="19050" r="9525" b="20955"/>
             <wp:docPr id="6" name="Picture 6"/>
             <wp:cNvGraphicFramePr>
               <a:graphicFrameLocks xmlns:a="http://schemas.openxmlformats.org/drawingml/2006/main" noChangeAspect="1"/>
@@ -1226,7 +1520,7 @@
                   <pic:spPr bwMode="auto">
                     <a:xfrm>
                       <a:off x="0" y="0"/>
-                      <a:ext cx="2286000" cy="4585974"/>
+                      <a:ext cx="2831874" cy="5681057"/>
                     </a:xfrm>
                     <a:prstGeom prst="rect">
                       <a:avLst/>
@@ -1272,45 +1566,50 @@
       <w:pPr>
         <w:spacing w:before="160" w:after="200"/>
         <w:jc w:val="center"/>
+        <w:rPr>
+          <w:rFonts w:ascii="Times New Roman" w:hAnsi="Times New Roman" w:cs="Times New Roman"/>
+        </w:rPr>
       </w:pPr>
     </w:p>
     <w:p>
       <w:pPr>
         <w:spacing w:before="160" w:after="200"/>
         <w:jc w:val="center"/>
+        <w:rPr>
+          <w:rFonts w:ascii="Times New Roman" w:hAnsi="Times New Roman" w:cs="Times New Roman"/>
+        </w:rPr>
       </w:pPr>
     </w:p>
     <w:p>
       <w:pPr>
         <w:spacing w:before="160" w:after="200"/>
         <w:jc w:val="center"/>
+        <w:rPr>
+          <w:rFonts w:ascii="Times New Roman" w:hAnsi="Times New Roman" w:cs="Times New Roman"/>
+        </w:rPr>
       </w:pPr>
     </w:p>
     <w:p>
       <w:pPr>
         <w:spacing w:before="160" w:after="200"/>
         <w:jc w:val="center"/>
+        <w:rPr>
+          <w:rFonts w:ascii="Times New Roman" w:hAnsi="Times New Roman" w:cs="Times New Roman"/>
+        </w:rPr>
       </w:pPr>
     </w:p>
     <w:p>
       <w:pPr>
-        <w:spacing w:before="160" w:after="200"/>
-        <w:jc w:val="center"/>
-      </w:pPr>
-    </w:p>
-    <w:p>
-      <w:pPr>
-        <w:spacing w:before="160" w:after="200"/>
-      </w:pPr>
-    </w:p>
-    <w:p>
-      <w:pPr>
         <w:shd w:val="clear" w:color="auto" w:fill="2F5496"/>
         <w:spacing w:before="140" w:after="140"/>
-        <w:ind w:left="120" w:right="120"/>
+        <w:ind w:right="120"/>
+        <w:rPr>
+          <w:rFonts w:ascii="Times New Roman" w:hAnsi="Times New Roman" w:cs="Times New Roman"/>
+        </w:rPr>
       </w:pPr>
       <w:r>
         <w:rPr>
+          <w:rFonts w:ascii="Times New Roman" w:hAnsi="Times New Roman" w:cs="Times New Roman"/>
           <w:b/>
           <w:color w:val="FFFFFF"/>
           <w:sz w:val="30"/>
@@ -1322,9 +1621,13 @@
     <w:p>
       <w:pPr>
         <w:spacing w:before="240" w:after="80"/>
+        <w:rPr>
+          <w:rFonts w:ascii="Times New Roman" w:hAnsi="Times New Roman" w:cs="Times New Roman"/>
+        </w:rPr>
       </w:pPr>
       <w:r>
         <w:rPr>
+          <w:rFonts w:ascii="Times New Roman" w:hAnsi="Times New Roman" w:cs="Times New Roman"/>
           <w:b/>
           <w:color w:val="FFFFFF"/>
           <w:sz w:val="20"/>
@@ -1333,10 +1636,14 @@
         <w:t xml:space="preserve">  Step 4  </w:t>
       </w:r>
       <w:r>
+        <w:rPr>
+          <w:rFonts w:ascii="Times New Roman" w:hAnsi="Times New Roman" w:cs="Times New Roman"/>
+        </w:rPr>
         <w:t xml:space="preserve">  </w:t>
       </w:r>
       <w:r>
         <w:rPr>
+          <w:rFonts w:ascii="Times New Roman" w:hAnsi="Times New Roman" w:cs="Times New Roman"/>
           <w:b/>
           <w:color w:val="2E74B5"/>
           <w:sz w:val="26"/>
@@ -1347,38 +1654,56 @@
     <w:p>
       <w:pPr>
         <w:jc w:val="both"/>
+        <w:rPr>
+          <w:rFonts w:ascii="Times New Roman" w:hAnsi="Times New Roman" w:cs="Times New Roman"/>
+        </w:rPr>
       </w:pPr>
       <w:r>
+        <w:rPr>
+          <w:rFonts w:ascii="Times New Roman" w:hAnsi="Times New Roman" w:cs="Times New Roman"/>
+        </w:rPr>
         <w:t xml:space="preserve">You will land on the </w:t>
       </w:r>
       <w:r>
         <w:rPr>
+          <w:rFonts w:ascii="Times New Roman" w:hAnsi="Times New Roman" w:cs="Times New Roman"/>
           <w:b/>
           <w:color w:val="1F3864"/>
         </w:rPr>
         <w:t>New Request</w:t>
       </w:r>
       <w:r>
+        <w:rPr>
+          <w:rFonts w:ascii="Times New Roman" w:hAnsi="Times New Roman" w:cs="Times New Roman"/>
+        </w:rPr>
         <w:t xml:space="preserve"> tab. Under </w:t>
       </w:r>
       <w:r>
         <w:rPr>
+          <w:rFonts w:ascii="Times New Roman" w:hAnsi="Times New Roman" w:cs="Times New Roman"/>
           <w:b/>
           <w:color w:val="1F3864"/>
         </w:rPr>
         <w:t>Select Late Attendance</w:t>
       </w:r>
       <w:r>
+        <w:rPr>
+          <w:rFonts w:ascii="Times New Roman" w:hAnsi="Times New Roman" w:cs="Times New Roman"/>
+        </w:rPr>
         <w:t xml:space="preserve">, the app lists your late check-ins — </w:t>
       </w:r>
       <w:r>
         <w:rPr>
+          <w:rFonts w:ascii="Times New Roman" w:hAnsi="Times New Roman" w:cs="Times New Roman"/>
           <w:b/>
           <w:color w:val="1F3864"/>
         </w:rPr>
         <w:t>only un-waived records from the last 30 days</w:t>
       </w:r>
       <w:r>
+        <w:rPr>
+          <w:rFonts w:ascii="Times New Roman" w:hAnsi="Times New Roman" w:cs="Times New Roman"/>
+        </w:rPr>
         <w:t>. Each card shows the date and time, how late you were, the deduction amount, and the reason you gave at check-in. Tap the card to select it; the selected card is highlighted.</w:t>
       </w:r>
     </w:p>
@@ -1390,9 +1715,13 @@
         <w:shd w:val="clear" w:color="auto" w:fill="FFF8E1"/>
         <w:spacing w:before="160"/>
         <w:ind w:left="150" w:right="150"/>
+        <w:rPr>
+          <w:rFonts w:ascii="Times New Roman" w:hAnsi="Times New Roman" w:cs="Times New Roman"/>
+        </w:rPr>
       </w:pPr>
       <w:r>
         <w:rPr>
+          <w:rFonts w:ascii="Times New Roman" w:hAnsi="Times New Roman" w:cs="Times New Roman"/>
           <w:i/>
           <w:color w:val="5D4037"/>
         </w:rPr>
@@ -1421,6 +1750,7 @@
             <w:pPr>
               <w:jc w:val="center"/>
               <w:rPr>
+                <w:rFonts w:ascii="Times New Roman" w:hAnsi="Times New Roman" w:cs="Times New Roman"/>
                 <w:noProof/>
               </w:rPr>
             </w:pPr>
@@ -1428,15 +1758,19 @@
           <w:p>
             <w:pPr>
               <w:jc w:val="center"/>
+              <w:rPr>
+                <w:rFonts w:ascii="Times New Roman" w:hAnsi="Times New Roman" w:cs="Times New Roman"/>
+              </w:rPr>
             </w:pPr>
             <w:r>
               <w:rPr>
+                <w:rFonts w:ascii="Times New Roman" w:hAnsi="Times New Roman" w:cs="Times New Roman"/>
                 <w:noProof/>
               </w:rPr>
               <w:drawing>
-                <wp:inline distT="0" distB="0" distL="0" distR="0" wp14:anchorId="1BE72061" wp14:editId="43785DFF">
-                  <wp:extent cx="1965263" cy="3924300"/>
-                  <wp:effectExtent l="19050" t="19050" r="16510" b="19050"/>
+                <wp:inline distT="0" distB="0" distL="0" distR="0" wp14:anchorId="1BE72061" wp14:editId="3AD30B31">
+                  <wp:extent cx="2447038" cy="4886325"/>
+                  <wp:effectExtent l="19050" t="19050" r="10795" b="9525"/>
                   <wp:docPr id="7" name="Picture 7"/>
                   <wp:cNvGraphicFramePr>
                     <a:graphicFrameLocks xmlns:a="http://schemas.openxmlformats.org/drawingml/2006/main" noChangeAspect="1"/>
@@ -1458,7 +1792,495 @@
                         <pic:spPr bwMode="auto">
                           <a:xfrm>
                             <a:off x="0" y="0"/>
-                            <a:ext cx="1965960" cy="3925692"/>
+                            <a:ext cx="2455587" cy="4903397"/>
+                          </a:xfrm>
+                          <a:prstGeom prst="rect">
+                            <a:avLst/>
+                          </a:prstGeom>
+                          <a:ln w="9525" cap="flat" cmpd="sng" algn="ctr">
+                            <a:solidFill>
+                              <a:srgbClr val="B0B0B0"/>
+                            </a:solidFill>
+                            <a:prstDash val="solid"/>
+                            <a:round/>
+                            <a:headEnd type="none" w="med" len="med"/>
+                            <a:tailEnd type="none" w="med" len="med"/>
+                            <a:extLst>
+                              <a:ext uri="{C807C97D-BFC1-408E-A445-0C87EB9F89A2}">
+                                <ask:lineSketchStyleProps xmlns:ask="http://schemas.microsoft.com/office/drawing/2018/sketchyshapes" sd="0">
+                                  <a:custGeom>
+                                    <a:avLst/>
+                                    <a:gdLst/>
+                                    <a:ahLst/>
+                                    <a:cxnLst/>
+                                    <a:rect l="0" t="0" r="0" b="0"/>
+                                    <a:pathLst/>
+                                  </a:custGeom>
+                                  <ask:type/>
+                                </ask:lineSketchStyleProps>
+                              </a:ext>
+                            </a:extLst>
+                          </a:ln>
+                          <a:extLst>
+                            <a:ext uri="{53640926-AAD7-44D8-BBD7-CCE9431645EC}">
+                              <a14:shadowObscured xmlns:a14="http://schemas.microsoft.com/office/drawing/2010/main"/>
+                            </a:ext>
+                          </a:extLst>
+                        </pic:spPr>
+                      </pic:pic>
+                    </a:graphicData>
+                  </a:graphic>
+                </wp:inline>
+              </w:drawing>
+            </w:r>
+          </w:p>
+        </w:tc>
+        <w:tc>
+          <w:tcPr>
+            <w:tcW w:w="4680" w:type="dxa"/>
+          </w:tcPr>
+          <w:p>
+            <w:pPr>
+              <w:rPr>
+                <w:rFonts w:ascii="Times New Roman" w:hAnsi="Times New Roman" w:cs="Times New Roman"/>
+                <w:noProof/>
+              </w:rPr>
+            </w:pPr>
+          </w:p>
+          <w:p>
+            <w:pPr>
+              <w:jc w:val="center"/>
+              <w:rPr>
+                <w:rFonts w:ascii="Times New Roman" w:hAnsi="Times New Roman" w:cs="Times New Roman"/>
+              </w:rPr>
+            </w:pPr>
+            <w:r>
+              <w:rPr>
+                <w:rFonts w:ascii="Times New Roman" w:hAnsi="Times New Roman" w:cs="Times New Roman"/>
+                <w:noProof/>
+              </w:rPr>
+              <w:drawing>
+                <wp:inline distT="0" distB="0" distL="0" distR="0" wp14:anchorId="6B381CB3" wp14:editId="04478FDC">
+                  <wp:extent cx="2581041" cy="4848225"/>
+                  <wp:effectExtent l="19050" t="19050" r="10160" b="9525"/>
+                  <wp:docPr id="8" name="Picture 8"/>
+                  <wp:cNvGraphicFramePr>
+                    <a:graphicFrameLocks xmlns:a="http://schemas.openxmlformats.org/drawingml/2006/main" noChangeAspect="1"/>
+                  </wp:cNvGraphicFramePr>
+                  <a:graphic xmlns:a="http://schemas.openxmlformats.org/drawingml/2006/main">
+                    <a:graphicData uri="http://schemas.openxmlformats.org/drawingml/2006/picture">
+                      <pic:pic xmlns:pic="http://schemas.openxmlformats.org/drawingml/2006/picture">
+                        <pic:nvPicPr>
+                          <pic:cNvPr id="0" name="07_select_late_attendance.png"/>
+                          <pic:cNvPicPr/>
+                        </pic:nvPicPr>
+                        <pic:blipFill rotWithShape="1">
+                          <a:blip r:embed="rId14"/>
+                          <a:srcRect t="4171" b="13130"/>
+                          <a:stretch>
+                            <a:fillRect/>
+                          </a:stretch>
+                        </pic:blipFill>
+                        <pic:spPr bwMode="auto">
+                          <a:xfrm>
+                            <a:off x="0" y="0"/>
+                            <a:ext cx="2598440" cy="4880907"/>
+                          </a:xfrm>
+                          <a:prstGeom prst="rect">
+                            <a:avLst/>
+                          </a:prstGeom>
+                          <a:ln w="9525" cap="flat" cmpd="sng" algn="ctr">
+                            <a:solidFill>
+                              <a:srgbClr val="B0B0B0"/>
+                            </a:solidFill>
+                            <a:prstDash val="solid"/>
+                            <a:round/>
+                            <a:headEnd type="none" w="med" len="med"/>
+                            <a:tailEnd type="none" w="med" len="med"/>
+                            <a:extLst>
+                              <a:ext uri="{C807C97D-BFC1-408E-A445-0C87EB9F89A2}">
+                                <ask:lineSketchStyleProps xmlns:ask="http://schemas.microsoft.com/office/drawing/2018/sketchyshapes" sd="0">
+                                  <a:custGeom>
+                                    <a:avLst/>
+                                    <a:gdLst/>
+                                    <a:ahLst/>
+                                    <a:cxnLst/>
+                                    <a:rect l="0" t="0" r="0" b="0"/>
+                                    <a:pathLst/>
+                                  </a:custGeom>
+                                  <ask:type/>
+                                </ask:lineSketchStyleProps>
+                              </a:ext>
+                            </a:extLst>
+                          </a:ln>
+                          <a:extLst>
+                            <a:ext uri="{53640926-AAD7-44D8-BBD7-CCE9431645EC}">
+                              <a14:shadowObscured xmlns:a14="http://schemas.microsoft.com/office/drawing/2010/main"/>
+                            </a:ext>
+                          </a:extLst>
+                        </pic:spPr>
+                      </pic:pic>
+                    </a:graphicData>
+                  </a:graphic>
+                </wp:inline>
+              </w:drawing>
+            </w:r>
+          </w:p>
+        </w:tc>
+      </w:tr>
+    </w:tbl>
+    <w:p>
+      <w:pPr>
+        <w:spacing w:after="120"/>
+        <w:rPr>
+          <w:rFonts w:ascii="Times New Roman" w:hAnsi="Times New Roman" w:cs="Times New Roman"/>
+        </w:rPr>
+      </w:pPr>
+    </w:p>
+    <w:p>
+      <w:pPr>
+        <w:spacing w:after="120"/>
+        <w:rPr>
+          <w:rFonts w:ascii="Times New Roman" w:hAnsi="Times New Roman" w:cs="Times New Roman"/>
+        </w:rPr>
+      </w:pPr>
+    </w:p>
+    <w:p>
+      <w:pPr>
+        <w:spacing w:before="240" w:after="80"/>
+        <w:rPr>
+          <w:rFonts w:ascii="Times New Roman" w:hAnsi="Times New Roman" w:cs="Times New Roman"/>
+        </w:rPr>
+      </w:pPr>
+      <w:r>
+        <w:rPr>
+          <w:rFonts w:ascii="Times New Roman" w:hAnsi="Times New Roman" w:cs="Times New Roman"/>
+          <w:b/>
+          <w:color w:val="FFFFFF"/>
+          <w:sz w:val="20"/>
+          <w:shd w:val="clear" w:color="auto" w:fill="2E74B5"/>
+        </w:rPr>
+        <w:lastRenderedPageBreak/>
+        <w:t xml:space="preserve">  Step 5  </w:t>
+      </w:r>
+      <w:r>
+        <w:rPr>
+          <w:rFonts w:ascii="Times New Roman" w:hAnsi="Times New Roman" w:cs="Times New Roman"/>
+        </w:rPr>
+        <w:t xml:space="preserve">  </w:t>
+      </w:r>
+      <w:r>
+        <w:rPr>
+          <w:rFonts w:ascii="Times New Roman" w:hAnsi="Times New Roman" w:cs="Times New Roman"/>
+          <w:b/>
+          <w:color w:val="2E74B5"/>
+          <w:sz w:val="26"/>
+        </w:rPr>
+        <w:t>Enter a Reason for Waiver</w:t>
+      </w:r>
+    </w:p>
+    <w:p>
+      <w:pPr>
+        <w:jc w:val="both"/>
+        <w:rPr>
+          <w:rFonts w:ascii="Times New Roman" w:hAnsi="Times New Roman" w:cs="Times New Roman"/>
+        </w:rPr>
+      </w:pPr>
+      <w:r>
+        <w:rPr>
+          <w:rFonts w:ascii="Times New Roman" w:hAnsi="Times New Roman" w:cs="Times New Roman"/>
+        </w:rPr>
+        <w:t xml:space="preserve">In the </w:t>
+      </w:r>
+      <w:r>
+        <w:rPr>
+          <w:rFonts w:ascii="Times New Roman" w:hAnsi="Times New Roman" w:cs="Times New Roman"/>
+          <w:b/>
+          <w:color w:val="1F3864"/>
+        </w:rPr>
+        <w:t>Reason for Waiver</w:t>
+      </w:r>
+      <w:r>
+        <w:rPr>
+          <w:rFonts w:ascii="Times New Roman" w:hAnsi="Times New Roman" w:cs="Times New Roman"/>
+        </w:rPr>
+        <w:t xml:space="preserve"> box, explain why the deduction should be cancelled (for example, “There was heavy traffic returning from hometown”). A reason is required before you can submit.</w:t>
+      </w:r>
+    </w:p>
+    <w:p>
+      <w:pPr>
+        <w:jc w:val="both"/>
+        <w:rPr>
+          <w:rFonts w:ascii="Times New Roman" w:hAnsi="Times New Roman" w:cs="Times New Roman"/>
+        </w:rPr>
+      </w:pPr>
+    </w:p>
+    <w:p>
+      <w:pPr>
+        <w:spacing w:before="160" w:after="200"/>
+        <w:jc w:val="center"/>
+        <w:rPr>
+          <w:rFonts w:ascii="Times New Roman" w:hAnsi="Times New Roman" w:cs="Times New Roman"/>
+        </w:rPr>
+      </w:pPr>
+      <w:r>
+        <w:rPr>
+          <w:rFonts w:ascii="Times New Roman" w:hAnsi="Times New Roman" w:cs="Times New Roman"/>
+          <w:noProof/>
+        </w:rPr>
+        <w:drawing>
+          <wp:inline distT="0" distB="0" distL="0" distR="0" wp14:anchorId="608B1856" wp14:editId="233B06CE">
+            <wp:extent cx="2957163" cy="5981700"/>
+            <wp:effectExtent l="19050" t="19050" r="15240" b="19050"/>
+            <wp:docPr id="9" name="Picture 9"/>
+            <wp:cNvGraphicFramePr>
+              <a:graphicFrameLocks xmlns:a="http://schemas.openxmlformats.org/drawingml/2006/main" noChangeAspect="1"/>
+            </wp:cNvGraphicFramePr>
+            <a:graphic xmlns:a="http://schemas.openxmlformats.org/drawingml/2006/main">
+              <a:graphicData uri="http://schemas.openxmlformats.org/drawingml/2006/picture">
+                <pic:pic xmlns:pic="http://schemas.openxmlformats.org/drawingml/2006/picture">
+                  <pic:nvPicPr>
+                    <pic:cNvPr id="0" name="08_enter_reason.png"/>
+                    <pic:cNvPicPr/>
+                  </pic:nvPicPr>
+                  <pic:blipFill rotWithShape="1">
+                    <a:blip r:embed="rId15"/>
+                    <a:srcRect t="5125" b="1590"/>
+                    <a:stretch>
+                      <a:fillRect/>
+                    </a:stretch>
+                  </pic:blipFill>
+                  <pic:spPr bwMode="auto">
+                    <a:xfrm>
+                      <a:off x="0" y="0"/>
+                      <a:ext cx="2962627" cy="5992752"/>
+                    </a:xfrm>
+                    <a:prstGeom prst="rect">
+                      <a:avLst/>
+                    </a:prstGeom>
+                    <a:ln w="9525" cap="flat" cmpd="sng" algn="ctr">
+                      <a:solidFill>
+                        <a:srgbClr val="B0B0B0"/>
+                      </a:solidFill>
+                      <a:prstDash val="solid"/>
+                      <a:round/>
+                      <a:headEnd type="none" w="med" len="med"/>
+                      <a:tailEnd type="none" w="med" len="med"/>
+                      <a:extLst>
+                        <a:ext uri="{C807C97D-BFC1-408E-A445-0C87EB9F89A2}">
+                          <ask:lineSketchStyleProps xmlns:ask="http://schemas.microsoft.com/office/drawing/2018/sketchyshapes" sd="0">
+                            <a:custGeom>
+                              <a:avLst/>
+                              <a:gdLst/>
+                              <a:ahLst/>
+                              <a:cxnLst/>
+                              <a:rect l="0" t="0" r="0" b="0"/>
+                              <a:pathLst/>
+                            </a:custGeom>
+                            <ask:type/>
+                          </ask:lineSketchStyleProps>
+                        </a:ext>
+                      </a:extLst>
+                    </a:ln>
+                    <a:extLst>
+                      <a:ext uri="{53640926-AAD7-44D8-BBD7-CCE9431645EC}">
+                        <a14:shadowObscured xmlns:a14="http://schemas.microsoft.com/office/drawing/2010/main"/>
+                      </a:ext>
+                    </a:extLst>
+                  </pic:spPr>
+                </pic:pic>
+              </a:graphicData>
+            </a:graphic>
+          </wp:inline>
+        </w:drawing>
+      </w:r>
+    </w:p>
+    <w:p>
+      <w:pPr>
+        <w:spacing w:before="160" w:after="200"/>
+        <w:jc w:val="center"/>
+        <w:rPr>
+          <w:rFonts w:ascii="Times New Roman" w:hAnsi="Times New Roman" w:cs="Times New Roman"/>
+        </w:rPr>
+      </w:pPr>
+    </w:p>
+    <w:p>
+      <w:pPr>
+        <w:spacing w:before="160" w:after="200"/>
+        <w:jc w:val="center"/>
+        <w:rPr>
+          <w:rFonts w:ascii="Times New Roman" w:hAnsi="Times New Roman" w:cs="Times New Roman"/>
+        </w:rPr>
+      </w:pPr>
+    </w:p>
+    <w:p>
+      <w:pPr>
+        <w:spacing w:before="240" w:after="80"/>
+        <w:rPr>
+          <w:rFonts w:ascii="Times New Roman" w:hAnsi="Times New Roman" w:cs="Times New Roman"/>
+        </w:rPr>
+      </w:pPr>
+      <w:r>
+        <w:rPr>
+          <w:rFonts w:ascii="Times New Roman" w:hAnsi="Times New Roman" w:cs="Times New Roman"/>
+          <w:b/>
+          <w:color w:val="FFFFFF"/>
+          <w:sz w:val="20"/>
+          <w:shd w:val="clear" w:color="auto" w:fill="2E74B5"/>
+        </w:rPr>
+        <w:t xml:space="preserve">  Step 6  </w:t>
+      </w:r>
+      <w:r>
+        <w:rPr>
+          <w:rFonts w:ascii="Times New Roman" w:hAnsi="Times New Roman" w:cs="Times New Roman"/>
+        </w:rPr>
+        <w:t xml:space="preserve">  </w:t>
+      </w:r>
+      <w:r>
+        <w:rPr>
+          <w:rFonts w:ascii="Times New Roman" w:hAnsi="Times New Roman" w:cs="Times New Roman"/>
+          <w:b/>
+          <w:color w:val="2E74B5"/>
+          <w:sz w:val="26"/>
+        </w:rPr>
+        <w:t>Review and Submit</w:t>
+      </w:r>
+    </w:p>
+    <w:p>
+      <w:pPr>
+        <w:jc w:val="both"/>
+        <w:rPr>
+          <w:rFonts w:ascii="Times New Roman" w:hAnsi="Times New Roman" w:cs="Times New Roman"/>
+        </w:rPr>
+      </w:pPr>
+      <w:r>
+        <w:rPr>
+          <w:rFonts w:ascii="Times New Roman" w:hAnsi="Times New Roman" w:cs="Times New Roman"/>
+        </w:rPr>
+        <w:lastRenderedPageBreak/>
+        <w:t xml:space="preserve">Once a late record is selected and a reason is filled in, the </w:t>
+      </w:r>
+      <w:r>
+        <w:rPr>
+          <w:rFonts w:ascii="Times New Roman" w:hAnsi="Times New Roman" w:cs="Times New Roman"/>
+          <w:b/>
+          <w:color w:val="1F3864"/>
+        </w:rPr>
+        <w:t>Submit Waiver Request</w:t>
+      </w:r>
+      <w:r>
+        <w:rPr>
+          <w:rFonts w:ascii="Times New Roman" w:hAnsi="Times New Roman" w:cs="Times New Roman"/>
+        </w:rPr>
+        <w:t xml:space="preserve"> button becomes active. Tap it. A confirmation dialog shows a summary — </w:t>
+      </w:r>
+      <w:r>
+        <w:rPr>
+          <w:rFonts w:ascii="Times New Roman" w:hAnsi="Times New Roman" w:cs="Times New Roman"/>
+          <w:b/>
+          <w:color w:val="1F3864"/>
+        </w:rPr>
+        <w:t>Date, Late time, Deduction, and Reason</w:t>
+      </w:r>
+      <w:r>
+        <w:rPr>
+          <w:rFonts w:ascii="Times New Roman" w:hAnsi="Times New Roman" w:cs="Times New Roman"/>
+        </w:rPr>
+        <w:t xml:space="preserve">. Check the details and tap </w:t>
+      </w:r>
+      <w:r>
+        <w:rPr>
+          <w:rFonts w:ascii="Times New Roman" w:hAnsi="Times New Roman" w:cs="Times New Roman"/>
+          <w:b/>
+          <w:color w:val="1F3864"/>
+        </w:rPr>
+        <w:t>SUBMIT</w:t>
+      </w:r>
+      <w:r>
+        <w:rPr>
+          <w:rFonts w:ascii="Times New Roman" w:hAnsi="Times New Roman" w:cs="Times New Roman"/>
+        </w:rPr>
+        <w:t xml:space="preserve"> to send it to your manager, or </w:t>
+      </w:r>
+      <w:r>
+        <w:rPr>
+          <w:rFonts w:ascii="Times New Roman" w:hAnsi="Times New Roman" w:cs="Times New Roman"/>
+          <w:b/>
+          <w:color w:val="1F3864"/>
+        </w:rPr>
+        <w:t>CANCEL</w:t>
+      </w:r>
+      <w:r>
+        <w:rPr>
+          <w:rFonts w:ascii="Times New Roman" w:hAnsi="Times New Roman" w:cs="Times New Roman"/>
+        </w:rPr>
+        <w:t xml:space="preserve"> to go back and edit.</w:t>
+      </w:r>
+    </w:p>
+    <w:p>
+      <w:pPr>
+        <w:jc w:val="both"/>
+        <w:rPr>
+          <w:rFonts w:ascii="Times New Roman" w:hAnsi="Times New Roman" w:cs="Times New Roman"/>
+        </w:rPr>
+      </w:pPr>
+    </w:p>
+    <w:tbl>
+      <w:tblPr>
+        <w:tblW w:w="0" w:type="auto"/>
+        <w:jc w:val="center"/>
+        <w:tblLook w:val="04A0" w:firstRow="1" w:lastRow="0" w:firstColumn="1" w:lastColumn="0" w:noHBand="0" w:noVBand="1"/>
+      </w:tblPr>
+      <w:tblGrid>
+        <w:gridCol w:w="4680"/>
+        <w:gridCol w:w="4680"/>
+      </w:tblGrid>
+      <w:tr>
+        <w:trPr>
+          <w:jc w:val="center"/>
+        </w:trPr>
+        <w:tc>
+          <w:tcPr>
+            <w:tcW w:w="4680" w:type="dxa"/>
+          </w:tcPr>
+          <w:p>
+            <w:pPr>
+              <w:jc w:val="center"/>
+              <w:rPr>
+                <w:rFonts w:ascii="Times New Roman" w:hAnsi="Times New Roman" w:cs="Times New Roman"/>
+              </w:rPr>
+            </w:pPr>
+            <w:r>
+              <w:rPr>
+                <w:rFonts w:ascii="Times New Roman" w:hAnsi="Times New Roman" w:cs="Times New Roman"/>
+                <w:noProof/>
+              </w:rPr>
+              <w:drawing>
+                <wp:inline distT="0" distB="0" distL="0" distR="0" wp14:anchorId="2CEF4696" wp14:editId="209126D2">
+                  <wp:extent cx="2686050" cy="5406814"/>
+                  <wp:effectExtent l="19050" t="19050" r="19050" b="22860"/>
+                  <wp:docPr id="10" name="Picture 10"/>
+                  <wp:cNvGraphicFramePr>
+                    <a:graphicFrameLocks xmlns:a="http://schemas.openxmlformats.org/drawingml/2006/main" noChangeAspect="1"/>
+                  </wp:cNvGraphicFramePr>
+                  <a:graphic xmlns:a="http://schemas.openxmlformats.org/drawingml/2006/main">
+                    <a:graphicData uri="http://schemas.openxmlformats.org/drawingml/2006/picture">
+                      <pic:pic xmlns:pic="http://schemas.openxmlformats.org/drawingml/2006/picture">
+                        <pic:nvPicPr>
+                          <pic:cNvPr id="0" name="09_ready_to_submit.png"/>
+                          <pic:cNvPicPr/>
+                        </pic:nvPicPr>
+                        <pic:blipFill rotWithShape="1">
+                          <a:blip r:embed="rId16"/>
+                          <a:srcRect t="4171" b="2998"/>
+                          <a:stretch>
+                            <a:fillRect/>
+                          </a:stretch>
+                        </pic:blipFill>
+                        <pic:spPr bwMode="auto">
+                          <a:xfrm>
+                            <a:off x="0" y="0"/>
+                            <a:ext cx="2692179" cy="5419152"/>
                           </a:xfrm>
                           <a:prstGeom prst="rect">
                             <a:avLst/>
@@ -1509,31 +2331,19 @@
             <w:pPr>
               <w:jc w:val="center"/>
               <w:rPr>
-                <w:noProof/>
+                <w:rFonts w:ascii="Times New Roman" w:hAnsi="Times New Roman" w:cs="Times New Roman"/>
               </w:rPr>
-            </w:pPr>
-          </w:p>
-          <w:p>
-            <w:pPr>
-              <w:jc w:val="center"/>
-              <w:rPr>
-                <w:noProof/>
-              </w:rPr>
-            </w:pPr>
-          </w:p>
-          <w:p>
-            <w:pPr>
-              <w:jc w:val="center"/>
             </w:pPr>
             <w:r>
               <w:rPr>
+                <w:rFonts w:ascii="Times New Roman" w:hAnsi="Times New Roman" w:cs="Times New Roman"/>
                 <w:noProof/>
               </w:rPr>
               <w:drawing>
-                <wp:inline distT="0" distB="0" distL="0" distR="0" wp14:anchorId="6B381CB3" wp14:editId="452FB5A7">
-                  <wp:extent cx="1965325" cy="3524250"/>
-                  <wp:effectExtent l="19050" t="19050" r="15875" b="19050"/>
-                  <wp:docPr id="8" name="Picture 8"/>
+                <wp:inline distT="0" distB="0" distL="0" distR="0" wp14:anchorId="59C2D8CA" wp14:editId="551E4904">
+                  <wp:extent cx="2707568" cy="5406390"/>
+                  <wp:effectExtent l="19050" t="19050" r="17145" b="22860"/>
+                  <wp:docPr id="11" name="Picture 11"/>
                   <wp:cNvGraphicFramePr>
                     <a:graphicFrameLocks xmlns:a="http://schemas.openxmlformats.org/drawingml/2006/main" noChangeAspect="1"/>
                   </wp:cNvGraphicFramePr>
@@ -1541,12 +2351,12 @@
                     <a:graphicData uri="http://schemas.openxmlformats.org/drawingml/2006/picture">
                       <pic:pic xmlns:pic="http://schemas.openxmlformats.org/drawingml/2006/picture">
                         <pic:nvPicPr>
-                          <pic:cNvPr id="0" name="07_select_late_attendance.png"/>
+                          <pic:cNvPr id="0" name="10_confirmation_dialog.png"/>
                           <pic:cNvPicPr/>
                         </pic:nvPicPr>
                         <pic:blipFill rotWithShape="1">
-                          <a:blip r:embed="rId14"/>
-                          <a:srcRect t="4171" b="13130"/>
+                          <a:blip r:embed="rId17"/>
+                          <a:srcRect t="4916" b="2998"/>
                           <a:stretch>
                             <a:fillRect/>
                           </a:stretch>
@@ -1554,7 +2364,7 @@
                         <pic:spPr bwMode="auto">
                           <a:xfrm>
                             <a:off x="0" y="0"/>
-                            <a:ext cx="1965960" cy="3525389"/>
+                            <a:ext cx="2719097" cy="5429412"/>
                           </a:xfrm>
                           <a:prstGeom prst="rect">
                             <a:avLst/>
@@ -1596,272 +2406,206 @@
               </w:drawing>
             </w:r>
           </w:p>
+          <w:p>
+            <w:pPr>
+              <w:jc w:val="center"/>
+              <w:rPr>
+                <w:rFonts w:ascii="Times New Roman" w:hAnsi="Times New Roman" w:cs="Times New Roman"/>
+              </w:rPr>
+            </w:pPr>
+          </w:p>
+          <w:p>
+            <w:pPr>
+              <w:jc w:val="center"/>
+              <w:rPr>
+                <w:rFonts w:ascii="Times New Roman" w:hAnsi="Times New Roman" w:cs="Times New Roman"/>
+              </w:rPr>
+            </w:pPr>
+          </w:p>
+          <w:p>
+            <w:pPr>
+              <w:jc w:val="center"/>
+              <w:rPr>
+                <w:rFonts w:ascii="Times New Roman" w:hAnsi="Times New Roman" w:cs="Times New Roman"/>
+              </w:rPr>
+            </w:pPr>
+          </w:p>
+          <w:p>
+            <w:pPr>
+              <w:jc w:val="center"/>
+              <w:rPr>
+                <w:rFonts w:ascii="Times New Roman" w:hAnsi="Times New Roman" w:cs="Times New Roman"/>
+              </w:rPr>
+            </w:pPr>
+          </w:p>
+          <w:p>
+            <w:pPr>
+              <w:jc w:val="center"/>
+              <w:rPr>
+                <w:rFonts w:ascii="Times New Roman" w:hAnsi="Times New Roman" w:cs="Times New Roman"/>
+              </w:rPr>
+            </w:pPr>
+          </w:p>
         </w:tc>
       </w:tr>
     </w:tbl>
     <w:p>
       <w:pPr>
-        <w:spacing w:after="120"/>
-      </w:pPr>
+        <w:shd w:val="clear" w:color="auto" w:fill="2F5496"/>
+        <w:spacing w:before="140" w:after="140"/>
+        <w:ind w:right="120"/>
+        <w:rPr>
+          <w:rFonts w:ascii="Times New Roman" w:hAnsi="Times New Roman" w:cs="Times New Roman"/>
+        </w:rPr>
+      </w:pPr>
+      <w:r>
+        <w:rPr>
+          <w:rFonts w:ascii="Times New Roman" w:hAnsi="Times New Roman" w:cs="Times New Roman"/>
+          <w:b/>
+          <w:color w:val="FFFFFF"/>
+          <w:sz w:val="30"/>
+        </w:rPr>
+        <w:lastRenderedPageBreak/>
+        <w:t>PART 3   Tracking Your Waiver</w:t>
+      </w:r>
     </w:p>
     <w:p>
       <w:pPr>
-        <w:spacing w:after="120"/>
-      </w:pPr>
-    </w:p>
-    <w:p>
-      <w:pPr>
-        <w:spacing w:after="120"/>
-      </w:pPr>
-    </w:p>
-    <w:p>
-      <w:pPr>
-        <w:spacing w:after="120"/>
-      </w:pPr>
-    </w:p>
-    <w:p>
-      <w:pPr>
-        <w:spacing w:after="120"/>
-      </w:pPr>
-    </w:p>
-    <w:p>
-      <w:pPr>
         <w:spacing w:before="240" w:after="80"/>
+        <w:rPr>
+          <w:rFonts w:ascii="Times New Roman" w:hAnsi="Times New Roman" w:cs="Times New Roman"/>
+        </w:rPr>
       </w:pPr>
       <w:r>
         <w:rPr>
+          <w:rFonts w:ascii="Times New Roman" w:hAnsi="Times New Roman" w:cs="Times New Roman"/>
           <w:b/>
           <w:color w:val="FFFFFF"/>
           <w:sz w:val="20"/>
           <w:shd w:val="clear" w:color="auto" w:fill="2E74B5"/>
         </w:rPr>
-        <w:lastRenderedPageBreak/>
-        <w:t xml:space="preserve">  Step 5  </w:t>
+        <w:t xml:space="preserve">  Step 7  </w:t>
       </w:r>
       <w:r>
+        <w:rPr>
+          <w:rFonts w:ascii="Times New Roman" w:hAnsi="Times New Roman" w:cs="Times New Roman"/>
+        </w:rPr>
         <w:t xml:space="preserve">  </w:t>
       </w:r>
       <w:r>
         <w:rPr>
+          <w:rFonts w:ascii="Times New Roman" w:hAnsi="Times New Roman" w:cs="Times New Roman"/>
           <w:b/>
           <w:color w:val="2E74B5"/>
           <w:sz w:val="26"/>
         </w:rPr>
-        <w:t>Enter a Reason for Waiver</w:t>
+        <w:t>My Requests</w:t>
       </w:r>
     </w:p>
     <w:p>
       <w:pPr>
         <w:jc w:val="both"/>
+        <w:rPr>
+          <w:rFonts w:ascii="Times New Roman" w:hAnsi="Times New Roman" w:cs="Times New Roman"/>
+        </w:rPr>
       </w:pPr>
       <w:r>
-        <w:t xml:space="preserve">In the </w:t>
+        <w:rPr>
+          <w:rFonts w:ascii="Times New Roman" w:hAnsi="Times New Roman" w:cs="Times New Roman"/>
+        </w:rPr>
+        <w:t xml:space="preserve">After you submit, a message confirms “Waiver request submitted for approval”. Tap the </w:t>
       </w:r>
       <w:r>
         <w:rPr>
+          <w:rFonts w:ascii="Times New Roman" w:hAnsi="Times New Roman" w:cs="Times New Roman"/>
           <w:b/>
           <w:color w:val="1F3864"/>
         </w:rPr>
-        <w:t>Reason for Waiver</w:t>
+        <w:t>My Requests</w:t>
       </w:r>
       <w:r>
-        <w:t xml:space="preserve"> box, explain why the deduction should be cancelled (for example, “There was heavy traffic returning from hometown”). A reason is required before you can submit.</w:t>
+        <w:rPr>
+          <w:rFonts w:ascii="Times New Roman" w:hAnsi="Times New Roman" w:cs="Times New Roman"/>
+        </w:rPr>
+        <w:t xml:space="preserve"> tab to see all the waivers you have raised. Each card shows the late date, the late time and deduction, your reason, and a </w:t>
+      </w:r>
+      <w:r>
+        <w:rPr>
+          <w:rFonts w:ascii="Times New Roman" w:hAnsi="Times New Roman" w:cs="Times New Roman"/>
+          <w:b/>
+          <w:color w:val="1F3864"/>
+        </w:rPr>
+        <w:t>status badge</w:t>
+      </w:r>
+      <w:r>
+        <w:rPr>
+          <w:rFonts w:ascii="Times New Roman" w:hAnsi="Times New Roman" w:cs="Times New Roman"/>
+        </w:rPr>
+        <w:t xml:space="preserve"> — </w:t>
+      </w:r>
+      <w:r>
+        <w:rPr>
+          <w:rFonts w:ascii="Times New Roman" w:hAnsi="Times New Roman" w:cs="Times New Roman"/>
+          <w:b/>
+          <w:color w:val="1F3864"/>
+        </w:rPr>
+        <w:t>Pending</w:t>
+      </w:r>
+      <w:r>
+        <w:rPr>
+          <w:rFonts w:ascii="Times New Roman" w:hAnsi="Times New Roman" w:cs="Times New Roman"/>
+        </w:rPr>
+        <w:t xml:space="preserve"> (awaiting your manager), </w:t>
+      </w:r>
+      <w:r>
+        <w:rPr>
+          <w:rFonts w:ascii="Times New Roman" w:hAnsi="Times New Roman" w:cs="Times New Roman"/>
+          <w:b/>
+          <w:color w:val="1F3864"/>
+        </w:rPr>
+        <w:t>Approved</w:t>
+      </w:r>
+      <w:r>
+        <w:rPr>
+          <w:rFonts w:ascii="Times New Roman" w:hAnsi="Times New Roman" w:cs="Times New Roman"/>
+        </w:rPr>
+        <w:t xml:space="preserve">, or </w:t>
+      </w:r>
+      <w:r>
+        <w:rPr>
+          <w:rFonts w:ascii="Times New Roman" w:hAnsi="Times New Roman" w:cs="Times New Roman"/>
+          <w:b/>
+          <w:color w:val="1F3864"/>
+        </w:rPr>
+        <w:t>Rejected</w:t>
+      </w:r>
+      <w:r>
+        <w:rPr>
+          <w:rFonts w:ascii="Times New Roman" w:hAnsi="Times New Roman" w:cs="Times New Roman"/>
+        </w:rPr>
+        <w:t xml:space="preserve">. When a waiver is </w:t>
+      </w:r>
+      <w:r>
+        <w:rPr>
+          <w:rFonts w:ascii="Times New Roman" w:hAnsi="Times New Roman" w:cs="Times New Roman"/>
+          <w:b/>
+          <w:color w:val="1F3864"/>
+        </w:rPr>
+        <w:t>Approved</w:t>
+      </w:r>
+      <w:r>
+        <w:rPr>
+          <w:rFonts w:ascii="Times New Roman" w:hAnsi="Times New Roman" w:cs="Times New Roman"/>
+        </w:rPr>
+        <w:t>, the deduction is removed.</w:t>
       </w:r>
     </w:p>
     <w:p>
       <w:pPr>
         <w:jc w:val="both"/>
-      </w:pPr>
-    </w:p>
-    <w:p>
-      <w:pPr>
-        <w:spacing w:before="160" w:after="200"/>
-        <w:jc w:val="center"/>
-      </w:pPr>
-      <w:r>
-        <w:rPr>
-          <w:noProof/>
-        </w:rPr>
-        <w:drawing>
-          <wp:inline distT="0" distB="0" distL="0" distR="0" wp14:anchorId="608B1856" wp14:editId="7B165597">
-            <wp:extent cx="2285365" cy="4622800"/>
-            <wp:effectExtent l="19050" t="19050" r="19685" b="25400"/>
-            <wp:docPr id="9" name="Picture 9"/>
-            <wp:cNvGraphicFramePr>
-              <a:graphicFrameLocks xmlns:a="http://schemas.openxmlformats.org/drawingml/2006/main" noChangeAspect="1"/>
-            </wp:cNvGraphicFramePr>
-            <a:graphic xmlns:a="http://schemas.openxmlformats.org/drawingml/2006/main">
-              <a:graphicData uri="http://schemas.openxmlformats.org/drawingml/2006/picture">
-                <pic:pic xmlns:pic="http://schemas.openxmlformats.org/drawingml/2006/picture">
-                  <pic:nvPicPr>
-                    <pic:cNvPr id="0" name="08_enter_reason.png"/>
-                    <pic:cNvPicPr/>
-                  </pic:nvPicPr>
-                  <pic:blipFill rotWithShape="1">
-                    <a:blip r:embed="rId15"/>
-                    <a:srcRect t="5125" b="1590"/>
-                    <a:stretch>
-                      <a:fillRect/>
-                    </a:stretch>
-                  </pic:blipFill>
-                  <pic:spPr bwMode="auto">
-                    <a:xfrm>
-                      <a:off x="0" y="0"/>
-                      <a:ext cx="2286000" cy="4624084"/>
-                    </a:xfrm>
-                    <a:prstGeom prst="rect">
-                      <a:avLst/>
-                    </a:prstGeom>
-                    <a:ln w="9525" cap="flat" cmpd="sng" algn="ctr">
-                      <a:solidFill>
-                        <a:srgbClr val="B0B0B0"/>
-                      </a:solidFill>
-                      <a:prstDash val="solid"/>
-                      <a:round/>
-                      <a:headEnd type="none" w="med" len="med"/>
-                      <a:tailEnd type="none" w="med" len="med"/>
-                      <a:extLst>
-                        <a:ext uri="{C807C97D-BFC1-408E-A445-0C87EB9F89A2}">
-                          <ask:lineSketchStyleProps xmlns:ask="http://schemas.microsoft.com/office/drawing/2018/sketchyshapes" sd="0">
-                            <a:custGeom>
-                              <a:avLst/>
-                              <a:gdLst/>
-                              <a:ahLst/>
-                              <a:cxnLst/>
-                              <a:rect l="0" t="0" r="0" b="0"/>
-                              <a:pathLst/>
-                            </a:custGeom>
-                            <ask:type/>
-                          </ask:lineSketchStyleProps>
-                        </a:ext>
-                      </a:extLst>
-                    </a:ln>
-                    <a:extLst>
-                      <a:ext uri="{53640926-AAD7-44D8-BBD7-CCE9431645EC}">
-                        <a14:shadowObscured xmlns:a14="http://schemas.microsoft.com/office/drawing/2010/main"/>
-                      </a:ext>
-                    </a:extLst>
-                  </pic:spPr>
-                </pic:pic>
-              </a:graphicData>
-            </a:graphic>
-          </wp:inline>
-        </w:drawing>
-      </w:r>
-    </w:p>
-    <w:p>
-      <w:pPr>
-        <w:spacing w:before="160" w:after="200"/>
-        <w:jc w:val="center"/>
-      </w:pPr>
-    </w:p>
-    <w:p>
-      <w:pPr>
-        <w:spacing w:before="160" w:after="200"/>
-        <w:jc w:val="center"/>
-      </w:pPr>
-    </w:p>
-    <w:p>
-      <w:pPr>
-        <w:spacing w:before="160" w:after="200"/>
-        <w:jc w:val="center"/>
-      </w:pPr>
-    </w:p>
-    <w:p>
-      <w:pPr>
-        <w:spacing w:before="160" w:after="200"/>
-        <w:jc w:val="center"/>
-      </w:pPr>
-    </w:p>
-    <w:p>
-      <w:pPr>
-        <w:spacing w:before="160" w:after="200"/>
-        <w:jc w:val="center"/>
-      </w:pPr>
-    </w:p>
-    <w:p>
-      <w:pPr>
-        <w:spacing w:before="160" w:after="200"/>
-        <w:jc w:val="center"/>
-      </w:pPr>
-    </w:p>
-    <w:p>
-      <w:pPr>
-        <w:spacing w:before="240" w:after="80"/>
-      </w:pPr>
-      <w:r>
-        <w:rPr>
-          <w:b/>
-          <w:color w:val="FFFFFF"/>
-          <w:sz w:val="20"/>
-          <w:shd w:val="clear" w:color="auto" w:fill="2E74B5"/>
-        </w:rPr>
-        <w:lastRenderedPageBreak/>
-        <w:t xml:space="preserve">  Step 6  </w:t>
-      </w:r>
-      <w:r>
-        <w:t xml:space="preserve">  </w:t>
-      </w:r>
-      <w:r>
-        <w:rPr>
-          <w:b/>
-          <w:color w:val="2E74B5"/>
-          <w:sz w:val="26"/>
-        </w:rPr>
-        <w:t>Review and Submit</w:t>
-      </w:r>
-    </w:p>
-    <w:p>
-      <w:pPr>
-        <w:jc w:val="both"/>
-      </w:pPr>
-      <w:r>
-        <w:t xml:space="preserve">Once a late record is selected and a reason is filled in, the </w:t>
-      </w:r>
-      <w:r>
-        <w:rPr>
-          <w:b/>
-          <w:color w:val="1F3864"/>
-        </w:rPr>
-        <w:t>Submit Waiver Request</w:t>
-      </w:r>
-      <w:r>
-        <w:t xml:space="preserve"> button becomes active. Tap it. A confirmation dialog shows a summary — </w:t>
-      </w:r>
-      <w:r>
-        <w:rPr>
-          <w:b/>
-          <w:color w:val="1F3864"/>
-        </w:rPr>
-        <w:t>Date, Late time, Deduction, and Reason</w:t>
-      </w:r>
-      <w:r>
-        <w:t xml:space="preserve">. Check the details and tap </w:t>
-      </w:r>
-      <w:r>
-        <w:rPr>
-          <w:b/>
-          <w:color w:val="1F3864"/>
-        </w:rPr>
-        <w:t>SUBMIT</w:t>
-      </w:r>
-      <w:r>
-        <w:t xml:space="preserve"> to send it to your manager, or </w:t>
-      </w:r>
-      <w:r>
-        <w:rPr>
-          <w:b/>
-          <w:color w:val="1F3864"/>
-        </w:rPr>
-        <w:t>CANCEL</w:t>
-      </w:r>
-      <w:r>
-        <w:t xml:space="preserve"> to go back and edit.</w:t>
-      </w:r>
-    </w:p>
-    <w:p>
-      <w:pPr>
-        <w:jc w:val="both"/>
+        <w:rPr>
+          <w:rFonts w:ascii="Times New Roman" w:hAnsi="Times New Roman" w:cs="Times New Roman"/>
+        </w:rPr>
       </w:pPr>
     </w:p>
     <w:tbl>
@@ -1885,16 +2629,20 @@
           <w:p>
             <w:pPr>
               <w:jc w:val="center"/>
+              <w:rPr>
+                <w:rFonts w:ascii="Times New Roman" w:hAnsi="Times New Roman" w:cs="Times New Roman"/>
+              </w:rPr>
             </w:pPr>
             <w:r>
               <w:rPr>
+                <w:rFonts w:ascii="Times New Roman" w:hAnsi="Times New Roman" w:cs="Times New Roman"/>
                 <w:noProof/>
               </w:rPr>
               <w:drawing>
-                <wp:inline distT="0" distB="0" distL="0" distR="0" wp14:anchorId="2CEF4696" wp14:editId="02FB3988">
-                  <wp:extent cx="1965325" cy="3956050"/>
-                  <wp:effectExtent l="19050" t="19050" r="15875" b="25400"/>
-                  <wp:docPr id="10" name="Picture 10"/>
+                <wp:inline distT="0" distB="0" distL="0" distR="0" wp14:anchorId="5C23737F" wp14:editId="5D2271D4">
+                  <wp:extent cx="2730319" cy="5495925"/>
+                  <wp:effectExtent l="19050" t="19050" r="13335" b="9525"/>
+                  <wp:docPr id="12" name="Picture 12"/>
                   <wp:cNvGraphicFramePr>
                     <a:graphicFrameLocks xmlns:a="http://schemas.openxmlformats.org/drawingml/2006/main" noChangeAspect="1"/>
                   </wp:cNvGraphicFramePr>
@@ -1902,12 +2650,12 @@
                     <a:graphicData uri="http://schemas.openxmlformats.org/drawingml/2006/picture">
                       <pic:pic xmlns:pic="http://schemas.openxmlformats.org/drawingml/2006/picture">
                         <pic:nvPicPr>
-                          <pic:cNvPr id="0" name="09_ready_to_submit.png"/>
+                          <pic:cNvPr id="0" name="11_submitted_my_requests.png"/>
                           <pic:cNvPicPr/>
                         </pic:nvPicPr>
                         <pic:blipFill rotWithShape="1">
-                          <a:blip r:embed="rId16"/>
-                          <a:srcRect t="4171" b="2998"/>
+                          <a:blip r:embed="rId18"/>
+                          <a:srcRect t="4320" b="2848"/>
                           <a:stretch>
                             <a:fillRect/>
                           </a:stretch>
@@ -1915,7 +2663,7 @@
                         <pic:spPr bwMode="auto">
                           <a:xfrm>
                             <a:off x="0" y="0"/>
-                            <a:ext cx="1965960" cy="3957328"/>
+                            <a:ext cx="2735859" cy="5507076"/>
                           </a:xfrm>
                           <a:prstGeom prst="rect">
                             <a:avLst/>
@@ -1965,16 +2713,20 @@
           <w:p>
             <w:pPr>
               <w:jc w:val="center"/>
+              <w:rPr>
+                <w:rFonts w:ascii="Times New Roman" w:hAnsi="Times New Roman" w:cs="Times New Roman"/>
+              </w:rPr>
             </w:pPr>
             <w:r>
               <w:rPr>
+                <w:rFonts w:ascii="Times New Roman" w:hAnsi="Times New Roman" w:cs="Times New Roman"/>
                 <w:noProof/>
               </w:rPr>
               <w:drawing>
-                <wp:inline distT="0" distB="0" distL="0" distR="0" wp14:anchorId="59C2D8CA" wp14:editId="10A4C9F8">
-                  <wp:extent cx="1965325" cy="3924300"/>
-                  <wp:effectExtent l="19050" t="19050" r="15875" b="19050"/>
-                  <wp:docPr id="11" name="Picture 11"/>
+                <wp:inline distT="0" distB="0" distL="0" distR="0" wp14:anchorId="06501DCD" wp14:editId="18D23163">
+                  <wp:extent cx="2706370" cy="5517823"/>
+                  <wp:effectExtent l="19050" t="19050" r="17780" b="26035"/>
+                  <wp:docPr id="13" name="Picture 13"/>
                   <wp:cNvGraphicFramePr>
                     <a:graphicFrameLocks xmlns:a="http://schemas.openxmlformats.org/drawingml/2006/main" noChangeAspect="1"/>
                   </wp:cNvGraphicFramePr>
@@ -1982,12 +2734,12 @@
                     <a:graphicData uri="http://schemas.openxmlformats.org/drawingml/2006/picture">
                       <pic:pic xmlns:pic="http://schemas.openxmlformats.org/drawingml/2006/picture">
                         <pic:nvPicPr>
-                          <pic:cNvPr id="0" name="10_confirmation_dialog.png"/>
+                          <pic:cNvPr id="0" name="12_my_requests_pending.png"/>
                           <pic:cNvPicPr/>
                         </pic:nvPicPr>
                         <pic:blipFill rotWithShape="1">
-                          <a:blip r:embed="rId17"/>
-                          <a:srcRect t="4916" b="2998"/>
+                          <a:blip r:embed="rId19"/>
+                          <a:srcRect l="-969" t="1472" r="969" b="4502"/>
                           <a:stretch>
                             <a:fillRect/>
                           </a:stretch>
@@ -1995,7 +2747,7 @@
                         <pic:spPr bwMode="auto">
                           <a:xfrm>
                             <a:off x="0" y="0"/>
-                            <a:ext cx="1965960" cy="3925568"/>
+                            <a:ext cx="2715087" cy="5535596"/>
                           </a:xfrm>
                           <a:prstGeom prst="rect">
                             <a:avLst/>
@@ -2039,42 +2791,9 @@
           </w:p>
           <w:p>
             <w:pPr>
-              <w:jc w:val="center"/>
-            </w:pPr>
-          </w:p>
-          <w:p>
-            <w:pPr>
-              <w:jc w:val="center"/>
-            </w:pPr>
-          </w:p>
-          <w:p>
-            <w:pPr>
-              <w:jc w:val="center"/>
-            </w:pPr>
-          </w:p>
-          <w:p>
-            <w:pPr>
-              <w:jc w:val="center"/>
-            </w:pPr>
-          </w:p>
-          <w:p>
-            <w:pPr>
-              <w:jc w:val="center"/>
-            </w:pPr>
-          </w:p>
-          <w:p>
-            <w:pPr>
-              <w:jc w:val="center"/>
-            </w:pPr>
-          </w:p>
-          <w:p>
-            <w:pPr>
-              <w:jc w:val="center"/>
-            </w:pPr>
-          </w:p>
-          <w:p>
-            <w:pPr>
-              <w:jc w:val="center"/>
+              <w:rPr>
+                <w:rFonts w:ascii="Times New Roman" w:hAnsi="Times New Roman" w:cs="Times New Roman"/>
+              </w:rPr>
             </w:pPr>
           </w:p>
         </w:tc>
@@ -2082,328 +2801,17 @@
     </w:tbl>
     <w:p>
       <w:pPr>
-        <w:spacing w:after="120"/>
-      </w:pPr>
-    </w:p>
-    <w:p>
-      <w:pPr>
-        <w:shd w:val="clear" w:color="auto" w:fill="2F5496"/>
-        <w:spacing w:before="140" w:after="140"/>
-        <w:ind w:left="120" w:right="120"/>
-      </w:pPr>
-      <w:r>
-        <w:rPr>
-          <w:b/>
-          <w:color w:val="FFFFFF"/>
-          <w:sz w:val="30"/>
-        </w:rPr>
-        <w:t>PART 3   Tracking Your Waiver</w:t>
-      </w:r>
-    </w:p>
-    <w:p>
-      <w:pPr>
-        <w:spacing w:before="240" w:after="80"/>
-      </w:pPr>
-      <w:r>
-        <w:rPr>
-          <w:b/>
-          <w:color w:val="FFFFFF"/>
-          <w:sz w:val="20"/>
-          <w:shd w:val="clear" w:color="auto" w:fill="2E74B5"/>
-        </w:rPr>
-        <w:t xml:space="preserve">  Step 7  </w:t>
-      </w:r>
-      <w:r>
-        <w:t xml:space="preserve">  </w:t>
-      </w:r>
-      <w:r>
-        <w:rPr>
-          <w:b/>
-          <w:color w:val="2E74B5"/>
-          <w:sz w:val="26"/>
-        </w:rPr>
-        <w:t>My Requests</w:t>
-      </w:r>
-    </w:p>
-    <w:p>
-      <w:pPr>
-        <w:jc w:val="both"/>
-      </w:pPr>
-      <w:r>
-        <w:t xml:space="preserve">After you submit, a message confirms “Waiver request submitted for approval”. Tap the </w:t>
-      </w:r>
-      <w:r>
-        <w:rPr>
-          <w:b/>
-          <w:color w:val="1F3864"/>
-        </w:rPr>
-        <w:t>My Requests</w:t>
-      </w:r>
-      <w:r>
-        <w:t xml:space="preserve"> tab to see all the waivers you have raised. Each card shows the late date, the late time and deduction, your reason, and a </w:t>
-      </w:r>
-      <w:r>
-        <w:rPr>
-          <w:b/>
-          <w:color w:val="1F3864"/>
-        </w:rPr>
-        <w:t>status badge</w:t>
-      </w:r>
-      <w:r>
-        <w:t xml:space="preserve"> — </w:t>
-      </w:r>
-      <w:r>
-        <w:rPr>
-          <w:b/>
-          <w:color w:val="1F3864"/>
-        </w:rPr>
-        <w:t>Pending</w:t>
-      </w:r>
-      <w:r>
-        <w:t xml:space="preserve"> (awaiting your manager), </w:t>
-      </w:r>
-      <w:r>
-        <w:rPr>
-          <w:b/>
-          <w:color w:val="1F3864"/>
-        </w:rPr>
-        <w:t>Approved</w:t>
-      </w:r>
-      <w:r>
-        <w:t xml:space="preserve">, or </w:t>
-      </w:r>
-      <w:r>
-        <w:rPr>
-          <w:b/>
-          <w:color w:val="1F3864"/>
-        </w:rPr>
-        <w:t>Rejected</w:t>
-      </w:r>
-      <w:r>
-        <w:t xml:space="preserve">. When a waiver is </w:t>
-      </w:r>
-      <w:r>
-        <w:rPr>
-          <w:b/>
-          <w:color w:val="1F3864"/>
-        </w:rPr>
-        <w:t>Approved</w:t>
-      </w:r>
-      <w:r>
-        <w:t>, the deduction is removed.</w:t>
-      </w:r>
-    </w:p>
-    <w:p>
-      <w:pPr>
-        <w:jc w:val="both"/>
-      </w:pPr>
-    </w:p>
-    <w:tbl>
-      <w:tblPr>
-        <w:tblW w:w="0" w:type="auto"/>
-        <w:jc w:val="center"/>
-        <w:tblLook w:val="04A0" w:firstRow="1" w:lastRow="0" w:firstColumn="1" w:lastColumn="0" w:noHBand="0" w:noVBand="1"/>
-      </w:tblPr>
-      <w:tblGrid>
-        <w:gridCol w:w="4680"/>
-        <w:gridCol w:w="4680"/>
-      </w:tblGrid>
-      <w:tr>
-        <w:trPr>
-          <w:jc w:val="center"/>
-        </w:trPr>
-        <w:tc>
-          <w:tcPr>
-            <w:tcW w:w="4680" w:type="dxa"/>
-          </w:tcPr>
-          <w:p>
-            <w:pPr>
-              <w:jc w:val="center"/>
-            </w:pPr>
-            <w:r>
-              <w:rPr>
-                <w:noProof/>
-              </w:rPr>
-              <w:drawing>
-                <wp:inline distT="0" distB="0" distL="0" distR="0" wp14:anchorId="5C23737F" wp14:editId="3FF484D6">
-                  <wp:extent cx="1965325" cy="3956050"/>
-                  <wp:effectExtent l="19050" t="19050" r="15875" b="25400"/>
-                  <wp:docPr id="12" name="Picture 12"/>
-                  <wp:cNvGraphicFramePr>
-                    <a:graphicFrameLocks xmlns:a="http://schemas.openxmlformats.org/drawingml/2006/main" noChangeAspect="1"/>
-                  </wp:cNvGraphicFramePr>
-                  <a:graphic xmlns:a="http://schemas.openxmlformats.org/drawingml/2006/main">
-                    <a:graphicData uri="http://schemas.openxmlformats.org/drawingml/2006/picture">
-                      <pic:pic xmlns:pic="http://schemas.openxmlformats.org/drawingml/2006/picture">
-                        <pic:nvPicPr>
-                          <pic:cNvPr id="0" name="11_submitted_my_requests.png"/>
-                          <pic:cNvPicPr/>
-                        </pic:nvPicPr>
-                        <pic:blipFill rotWithShape="1">
-                          <a:blip r:embed="rId18"/>
-                          <a:srcRect t="4320" b="2848"/>
-                          <a:stretch>
-                            <a:fillRect/>
-                          </a:stretch>
-                        </pic:blipFill>
-                        <pic:spPr bwMode="auto">
-                          <a:xfrm>
-                            <a:off x="0" y="0"/>
-                            <a:ext cx="1965960" cy="3957328"/>
-                          </a:xfrm>
-                          <a:prstGeom prst="rect">
-                            <a:avLst/>
-                          </a:prstGeom>
-                          <a:ln w="9525" cap="flat" cmpd="sng" algn="ctr">
-                            <a:solidFill>
-                              <a:srgbClr val="B0B0B0"/>
-                            </a:solidFill>
-                            <a:prstDash val="solid"/>
-                            <a:round/>
-                            <a:headEnd type="none" w="med" len="med"/>
-                            <a:tailEnd type="none" w="med" len="med"/>
-                            <a:extLst>
-                              <a:ext uri="{C807C97D-BFC1-408E-A445-0C87EB9F89A2}">
-                                <ask:lineSketchStyleProps xmlns:ask="http://schemas.microsoft.com/office/drawing/2018/sketchyshapes" sd="0">
-                                  <a:custGeom>
-                                    <a:avLst/>
-                                    <a:gdLst/>
-                                    <a:ahLst/>
-                                    <a:cxnLst/>
-                                    <a:rect l="0" t="0" r="0" b="0"/>
-                                    <a:pathLst/>
-                                  </a:custGeom>
-                                  <ask:type/>
-                                </ask:lineSketchStyleProps>
-                              </a:ext>
-                            </a:extLst>
-                          </a:ln>
-                          <a:extLst>
-                            <a:ext uri="{53640926-AAD7-44D8-BBD7-CCE9431645EC}">
-                              <a14:shadowObscured xmlns:a14="http://schemas.microsoft.com/office/drawing/2010/main"/>
-                            </a:ext>
-                          </a:extLst>
-                        </pic:spPr>
-                      </pic:pic>
-                    </a:graphicData>
-                  </a:graphic>
-                </wp:inline>
-              </w:drawing>
-            </w:r>
-          </w:p>
-        </w:tc>
-        <w:tc>
-          <w:tcPr>
-            <w:tcW w:w="4680" w:type="dxa"/>
-          </w:tcPr>
-          <w:p>
-            <w:pPr>
-              <w:jc w:val="center"/>
-            </w:pPr>
-            <w:r>
-              <w:rPr>
-                <w:noProof/>
-              </w:rPr>
-              <w:drawing>
-                <wp:inline distT="0" distB="0" distL="0" distR="0" wp14:anchorId="06501DCD" wp14:editId="2E3591C1">
-                  <wp:extent cx="1965270" cy="4006850"/>
-                  <wp:effectExtent l="19050" t="19050" r="16510" b="12700"/>
-                  <wp:docPr id="13" name="Picture 13"/>
-                  <wp:cNvGraphicFramePr>
-                    <a:graphicFrameLocks xmlns:a="http://schemas.openxmlformats.org/drawingml/2006/main" noChangeAspect="1"/>
-                  </wp:cNvGraphicFramePr>
-                  <a:graphic xmlns:a="http://schemas.openxmlformats.org/drawingml/2006/main">
-                    <a:graphicData uri="http://schemas.openxmlformats.org/drawingml/2006/picture">
-                      <pic:pic xmlns:pic="http://schemas.openxmlformats.org/drawingml/2006/picture">
-                        <pic:nvPicPr>
-                          <pic:cNvPr id="0" name="12_my_requests_pending.png"/>
-                          <pic:cNvPicPr/>
-                        </pic:nvPicPr>
-                        <pic:blipFill rotWithShape="1">
-                          <a:blip r:embed="rId19"/>
-                          <a:srcRect l="-969" t="1472" r="969" b="4502"/>
-                          <a:stretch>
-                            <a:fillRect/>
-                          </a:stretch>
-                        </pic:blipFill>
-                        <pic:spPr bwMode="auto">
-                          <a:xfrm>
-                            <a:off x="0" y="0"/>
-                            <a:ext cx="1965960" cy="4008256"/>
-                          </a:xfrm>
-                          <a:prstGeom prst="rect">
-                            <a:avLst/>
-                          </a:prstGeom>
-                          <a:ln w="9525" cap="flat" cmpd="sng" algn="ctr">
-                            <a:solidFill>
-                              <a:srgbClr val="B0B0B0"/>
-                            </a:solidFill>
-                            <a:prstDash val="solid"/>
-                            <a:round/>
-                            <a:headEnd type="none" w="med" len="med"/>
-                            <a:tailEnd type="none" w="med" len="med"/>
-                            <a:extLst>
-                              <a:ext uri="{C807C97D-BFC1-408E-A445-0C87EB9F89A2}">
-                                <ask:lineSketchStyleProps xmlns:ask="http://schemas.microsoft.com/office/drawing/2018/sketchyshapes" sd="0">
-                                  <a:custGeom>
-                                    <a:avLst/>
-                                    <a:gdLst/>
-                                    <a:ahLst/>
-                                    <a:cxnLst/>
-                                    <a:rect l="0" t="0" r="0" b="0"/>
-                                    <a:pathLst/>
-                                  </a:custGeom>
-                                  <ask:type/>
-                                </ask:lineSketchStyleProps>
-                              </a:ext>
-                            </a:extLst>
-                          </a:ln>
-                          <a:extLst>
-                            <a:ext uri="{53640926-AAD7-44D8-BBD7-CCE9431645EC}">
-                              <a14:shadowObscured xmlns:a14="http://schemas.microsoft.com/office/drawing/2010/main"/>
-                            </a:ext>
-                          </a:extLst>
-                        </pic:spPr>
-                      </pic:pic>
-                    </a:graphicData>
-                  </a:graphic>
-                </wp:inline>
-              </w:drawing>
-            </w:r>
-          </w:p>
-          <w:p>
-            <w:pPr>
-              <w:jc w:val="center"/>
-            </w:pPr>
-          </w:p>
-          <w:p/>
-          <w:p>
-            <w:pPr>
-              <w:jc w:val="center"/>
-            </w:pPr>
-          </w:p>
-          <w:p>
-            <w:pPr>
-              <w:jc w:val="center"/>
-            </w:pPr>
-          </w:p>
-        </w:tc>
-      </w:tr>
-    </w:tbl>
-    <w:p>
-      <w:pPr>
-        <w:spacing w:after="120"/>
-      </w:pPr>
-    </w:p>
-    <w:p>
-      <w:pPr>
         <w:pBdr>
           <w:bottom w:val="single" w:sz="8" w:space="4" w:color="5B9BD5"/>
         </w:pBdr>
         <w:spacing w:before="280"/>
+        <w:rPr>
+          <w:rFonts w:ascii="Times New Roman" w:hAnsi="Times New Roman" w:cs="Times New Roman"/>
+        </w:rPr>
       </w:pPr>
       <w:r>
         <w:rPr>
+          <w:rFonts w:ascii="Times New Roman" w:hAnsi="Times New Roman" w:cs="Times New Roman"/>
           <w:b/>
           <w:color w:val="2E74B5"/>
           <w:sz w:val="30"/>
@@ -2415,8 +2823,14 @@
     <w:p>
       <w:pPr>
         <w:jc w:val="both"/>
+        <w:rPr>
+          <w:rFonts w:ascii="Times New Roman" w:hAnsi="Times New Roman" w:cs="Times New Roman"/>
+        </w:rPr>
       </w:pPr>
       <w:r>
+        <w:rPr>
+          <w:rFonts w:ascii="Times New Roman" w:hAnsi="Times New Roman" w:cs="Times New Roman"/>
+        </w:rPr>
         <w:t>Each card under Select Late Attendance summarises one late check-in:</w:t>
       </w:r>
     </w:p>
@@ -2443,9 +2857,13 @@
           <w:p>
             <w:pPr>
               <w:spacing w:after="40"/>
+              <w:rPr>
+                <w:rFonts w:ascii="Times New Roman" w:hAnsi="Times New Roman" w:cs="Times New Roman"/>
+              </w:rPr>
             </w:pPr>
             <w:r>
               <w:rPr>
+                <w:rFonts w:ascii="Times New Roman" w:hAnsi="Times New Roman" w:cs="Times New Roman"/>
                 <w:b/>
                 <w:color w:val="FFFFFF"/>
                 <w:sz w:val="20"/>
@@ -2462,9 +2880,13 @@
           <w:p>
             <w:pPr>
               <w:spacing w:after="40"/>
+              <w:rPr>
+                <w:rFonts w:ascii="Times New Roman" w:hAnsi="Times New Roman" w:cs="Times New Roman"/>
+              </w:rPr>
             </w:pPr>
             <w:r>
               <w:rPr>
+                <w:rFonts w:ascii="Times New Roman" w:hAnsi="Times New Roman" w:cs="Times New Roman"/>
                 <w:b/>
                 <w:color w:val="FFFFFF"/>
                 <w:sz w:val="20"/>
@@ -2486,9 +2908,13 @@
           <w:p>
             <w:pPr>
               <w:spacing w:after="40"/>
+              <w:rPr>
+                <w:rFonts w:ascii="Times New Roman" w:hAnsi="Times New Roman" w:cs="Times New Roman"/>
+              </w:rPr>
             </w:pPr>
             <w:r>
               <w:rPr>
+                <w:rFonts w:ascii="Times New Roman" w:hAnsi="Times New Roman" w:cs="Times New Roman"/>
                 <w:b/>
                 <w:color w:val="1F3864"/>
                 <w:sz w:val="20"/>
@@ -2505,9 +2931,13 @@
           <w:p>
             <w:pPr>
               <w:spacing w:after="40"/>
+              <w:rPr>
+                <w:rFonts w:ascii="Times New Roman" w:hAnsi="Times New Roman" w:cs="Times New Roman"/>
+              </w:rPr>
             </w:pPr>
             <w:r>
               <w:rPr>
+                <w:rFonts w:ascii="Times New Roman" w:hAnsi="Times New Roman" w:cs="Times New Roman"/>
                 <w:sz w:val="20"/>
               </w:rPr>
               <w:t>The day and the time you checked in late.</w:t>
@@ -2526,9 +2956,13 @@
           <w:p>
             <w:pPr>
               <w:spacing w:after="40"/>
+              <w:rPr>
+                <w:rFonts w:ascii="Times New Roman" w:hAnsi="Times New Roman" w:cs="Times New Roman"/>
+              </w:rPr>
             </w:pPr>
             <w:r>
               <w:rPr>
+                <w:rFonts w:ascii="Times New Roman" w:hAnsi="Times New Roman" w:cs="Times New Roman"/>
                 <w:b/>
                 <w:color w:val="1F3864"/>
                 <w:sz w:val="20"/>
@@ -2544,9 +2978,13 @@
           <w:p>
             <w:pPr>
               <w:spacing w:after="40"/>
+              <w:rPr>
+                <w:rFonts w:ascii="Times New Roman" w:hAnsi="Times New Roman" w:cs="Times New Roman"/>
+              </w:rPr>
             </w:pPr>
             <w:r>
               <w:rPr>
+                <w:rFonts w:ascii="Times New Roman" w:hAnsi="Times New Roman" w:cs="Times New Roman"/>
                 <w:sz w:val="20"/>
               </w:rPr>
               <w:t>How long after your expected start time you checked in (e.g. Late 6h 48m).</w:t>
@@ -2566,9 +3004,13 @@
           <w:p>
             <w:pPr>
               <w:spacing w:after="40"/>
+              <w:rPr>
+                <w:rFonts w:ascii="Times New Roman" w:hAnsi="Times New Roman" w:cs="Times New Roman"/>
+              </w:rPr>
             </w:pPr>
             <w:r>
               <w:rPr>
+                <w:rFonts w:ascii="Times New Roman" w:hAnsi="Times New Roman" w:cs="Times New Roman"/>
                 <w:b/>
                 <w:color w:val="1F3864"/>
                 <w:sz w:val="20"/>
@@ -2585,9 +3027,13 @@
           <w:p>
             <w:pPr>
               <w:spacing w:after="40"/>
+              <w:rPr>
+                <w:rFonts w:ascii="Times New Roman" w:hAnsi="Times New Roman" w:cs="Times New Roman"/>
+              </w:rPr>
             </w:pPr>
             <w:r>
               <w:rPr>
+                <w:rFonts w:ascii="Times New Roman" w:hAnsi="Times New Roman" w:cs="Times New Roman"/>
                 <w:sz w:val="20"/>
               </w:rPr>
               <w:t>The salary amount currently deducted for that late arrival (e.g. 50).</w:t>
@@ -2606,9 +3052,13 @@
           <w:p>
             <w:pPr>
               <w:spacing w:after="40"/>
+              <w:rPr>
+                <w:rFonts w:ascii="Times New Roman" w:hAnsi="Times New Roman" w:cs="Times New Roman"/>
+              </w:rPr>
             </w:pPr>
             <w:r>
               <w:rPr>
+                <w:rFonts w:ascii="Times New Roman" w:hAnsi="Times New Roman" w:cs="Times New Roman"/>
                 <w:b/>
                 <w:color w:val="1F3864"/>
                 <w:sz w:val="20"/>
@@ -2624,9 +3074,13 @@
           <w:p>
             <w:pPr>
               <w:spacing w:after="40"/>
+              <w:rPr>
+                <w:rFonts w:ascii="Times New Roman" w:hAnsi="Times New Roman" w:cs="Times New Roman"/>
+              </w:rPr>
             </w:pPr>
             <w:r>
               <w:rPr>
+                <w:rFonts w:ascii="Times New Roman" w:hAnsi="Times New Roman" w:cs="Times New Roman"/>
                 <w:sz w:val="20"/>
               </w:rPr>
               <w:t>The short reason you typed on the “You're Late” screen at check-in.</w:t>
@@ -2638,6 +3092,9 @@
     <w:p>
       <w:pPr>
         <w:spacing w:after="40"/>
+        <w:rPr>
+          <w:rFonts w:ascii="Times New Roman" w:hAnsi="Times New Roman" w:cs="Times New Roman"/>
+        </w:rPr>
       </w:pPr>
     </w:p>
     <w:p>
@@ -2646,9 +3103,13 @@
           <w:bottom w:val="single" w:sz="8" w:space="4" w:color="5B9BD5"/>
         </w:pBdr>
         <w:spacing w:before="280"/>
+        <w:rPr>
+          <w:rFonts w:ascii="Times New Roman" w:hAnsi="Times New Roman" w:cs="Times New Roman"/>
+        </w:rPr>
       </w:pPr>
       <w:r>
         <w:rPr>
+          <w:rFonts w:ascii="Times New Roman" w:hAnsi="Times New Roman" w:cs="Times New Roman"/>
           <w:b/>
           <w:color w:val="2E74B5"/>
           <w:sz w:val="30"/>
@@ -2679,9 +3140,13 @@
           <w:p>
             <w:pPr>
               <w:spacing w:after="40"/>
+              <w:rPr>
+                <w:rFonts w:ascii="Times New Roman" w:hAnsi="Times New Roman" w:cs="Times New Roman"/>
+              </w:rPr>
             </w:pPr>
             <w:r>
               <w:rPr>
+                <w:rFonts w:ascii="Times New Roman" w:hAnsi="Times New Roman" w:cs="Times New Roman"/>
                 <w:b/>
                 <w:color w:val="FFFFFF"/>
                 <w:sz w:val="20"/>
@@ -2698,9 +3163,13 @@
           <w:p>
             <w:pPr>
               <w:spacing w:after="40"/>
+              <w:rPr>
+                <w:rFonts w:ascii="Times New Roman" w:hAnsi="Times New Roman" w:cs="Times New Roman"/>
+              </w:rPr>
             </w:pPr>
             <w:r>
               <w:rPr>
+                <w:rFonts w:ascii="Times New Roman" w:hAnsi="Times New Roman" w:cs="Times New Roman"/>
                 <w:b/>
                 <w:color w:val="FFFFFF"/>
                 <w:sz w:val="20"/>
@@ -2722,9 +3191,13 @@
           <w:p>
             <w:pPr>
               <w:spacing w:after="40"/>
+              <w:rPr>
+                <w:rFonts w:ascii="Times New Roman" w:hAnsi="Times New Roman" w:cs="Times New Roman"/>
+              </w:rPr>
             </w:pPr>
             <w:r>
               <w:rPr>
+                <w:rFonts w:ascii="Times New Roman" w:hAnsi="Times New Roman" w:cs="Times New Roman"/>
                 <w:b/>
                 <w:color w:val="1F3864"/>
                 <w:sz w:val="20"/>
@@ -2741,9 +3214,13 @@
           <w:p>
             <w:pPr>
               <w:spacing w:after="40"/>
+              <w:rPr>
+                <w:rFonts w:ascii="Times New Roman" w:hAnsi="Times New Roman" w:cs="Times New Roman"/>
+              </w:rPr>
             </w:pPr>
             <w:r>
               <w:rPr>
+                <w:rFonts w:ascii="Times New Roman" w:hAnsi="Times New Roman" w:cs="Times New Roman"/>
                 <w:sz w:val="20"/>
               </w:rPr>
               <w:t>Submitted and waiting for your manager to approve or reject. The deduction still stands for now.</w:t>
@@ -2762,9 +3239,13 @@
           <w:p>
             <w:pPr>
               <w:spacing w:after="40"/>
+              <w:rPr>
+                <w:rFonts w:ascii="Times New Roman" w:hAnsi="Times New Roman" w:cs="Times New Roman"/>
+              </w:rPr>
             </w:pPr>
             <w:r>
               <w:rPr>
+                <w:rFonts w:ascii="Times New Roman" w:hAnsi="Times New Roman" w:cs="Times New Roman"/>
                 <w:b/>
                 <w:color w:val="1F3864"/>
                 <w:sz w:val="20"/>
@@ -2780,9 +3261,13 @@
           <w:p>
             <w:pPr>
               <w:spacing w:after="40"/>
+              <w:rPr>
+                <w:rFonts w:ascii="Times New Roman" w:hAnsi="Times New Roman" w:cs="Times New Roman"/>
+              </w:rPr>
             </w:pPr>
             <w:r>
               <w:rPr>
+                <w:rFonts w:ascii="Times New Roman" w:hAnsi="Times New Roman" w:cs="Times New Roman"/>
                 <w:sz w:val="20"/>
               </w:rPr>
               <w:t>Your manager agreed — the deduction is waived and removed from your pay.</w:t>
@@ -2802,9 +3287,13 @@
           <w:p>
             <w:pPr>
               <w:spacing w:after="40"/>
+              <w:rPr>
+                <w:rFonts w:ascii="Times New Roman" w:hAnsi="Times New Roman" w:cs="Times New Roman"/>
+              </w:rPr>
             </w:pPr>
             <w:r>
               <w:rPr>
+                <w:rFonts w:ascii="Times New Roman" w:hAnsi="Times New Roman" w:cs="Times New Roman"/>
                 <w:b/>
                 <w:color w:val="1F3864"/>
                 <w:sz w:val="20"/>
@@ -2821,9 +3310,13 @@
           <w:p>
             <w:pPr>
               <w:spacing w:after="40"/>
+              <w:rPr>
+                <w:rFonts w:ascii="Times New Roman" w:hAnsi="Times New Roman" w:cs="Times New Roman"/>
+              </w:rPr>
             </w:pPr>
             <w:r>
               <w:rPr>
+                <w:rFonts w:ascii="Times New Roman" w:hAnsi="Times New Roman" w:cs="Times New Roman"/>
                 <w:sz w:val="20"/>
               </w:rPr>
               <w:t>Your manager did not agree — the deduction stays as it was.</w:t>
@@ -2835,6 +3328,9 @@
     <w:p>
       <w:pPr>
         <w:spacing w:after="40"/>
+        <w:rPr>
+          <w:rFonts w:ascii="Times New Roman" w:hAnsi="Times New Roman" w:cs="Times New Roman"/>
+        </w:rPr>
       </w:pPr>
     </w:p>
     <w:sectPr>
@@ -2981,6 +3477,27 @@
       <w:fldChar w:fldCharType="end"/>
     </w:r>
   </w:p>
+  <w:p>
+    <w:pPr>
+      <w:pStyle w:val="Footer"/>
+      <w:jc w:val="center"/>
+    </w:pPr>
+    <w:r>
+      <w:rPr>
+        <w:b/>
+        <w:color w:val="1F3864"/>
+        <w:sz w:val="18"/>
+      </w:rPr>
+      <w:t>369ai.Biz</w:t>
+    </w:r>
+    <w:r>
+      <w:rPr>
+        <w:color w:val="595959"/>
+        <w:sz w:val="18"/>
+      </w:rPr>
+      <w:t xml:space="preserve">  ·  Late Waiver Request — Employee Manual</w:t>
+    </w:r>
+  </w:p>
 </w:ftr>
 </file>
 
@@ -3220,7 +3737,7 @@
   <w:abstractNum w:abstractNumId="8" w15:restartNumberingAfterBreak="0">
     <w:nsid w:val="FFFFFF89"/>
     <w:multiLevelType w:val="singleLevel"/>
-    <w:tmpl w:val="29761A62"/>
+    <w:tmpl w:val="00CA88DE"/>
     <w:lvl w:ilvl="0">
       <w:start w:val="1"/>
       <w:numFmt w:val="bullet"/>

</xml_diff>